<commit_message>
Word paper: 12 pt (16 px) Times New Roman body, 14 pt headings, theme fonts removed
</commit_message>
<xml_diff>
--- a/paper/Major_Project_Paper.docx
+++ b/paper/Major_Project_Paper.docx
@@ -7217,8 +7217,8 @@
     <w:name w:val="Normal"/>
     <w:qFormat/>
     <w:rPr>
-      <w:rFonts w:ascii="Times New Roman" w:hAnsi="Times New Roman"/>
-      <w:sz w:val="20"/>
+      <w:rFonts w:ascii="Times New Roman" w:hAnsi="Times New Roman" w:cs="Times New Roman" w:eastAsia="Times New Roman"/>
+      <w:sz w:val="24"/>
     </w:rPr>
   </w:style>
   <w:style w:type="paragraph" w:styleId="BodyText">
@@ -7230,8 +7230,8 @@
       <w:spacing w:before="180" w:after="180"/>
     </w:pPr>
     <w:rPr>
-      <w:rFonts w:ascii="Times New Roman" w:hAnsi="Times New Roman"/>
-      <w:sz w:val="20"/>
+      <w:rFonts w:ascii="Times New Roman" w:hAnsi="Times New Roman" w:cs="Times New Roman" w:eastAsia="Times New Roman"/>
+      <w:sz w:val="24"/>
     </w:rPr>
   </w:style>
   <w:style w:type="paragraph" w:customStyle="1" w:styleId="FirstParagraph">
@@ -7240,8 +7240,8 @@
     <w:next w:val="BodyText"/>
     <w:qFormat/>
     <w:rPr>
-      <w:rFonts w:ascii="Times New Roman" w:hAnsi="Times New Roman"/>
-      <w:sz w:val="20"/>
+      <w:rFonts w:ascii="Times New Roman" w:hAnsi="Times New Roman" w:cs="Times New Roman" w:eastAsia="Times New Roman"/>
+      <w:sz w:val="24"/>
     </w:rPr>
   </w:style>
   <w:style w:type="paragraph" w:customStyle="1" w:styleId="Compact">
@@ -7252,8 +7252,8 @@
       <w:spacing w:before="36" w:after="36"/>
     </w:pPr>
     <w:rPr>
-      <w:rFonts w:ascii="Times New Roman" w:hAnsi="Times New Roman"/>
-      <w:sz w:val="20"/>
+      <w:rFonts w:ascii="Times New Roman" w:hAnsi="Times New Roman" w:cs="Times New Roman" w:eastAsia="Times New Roman"/>
+      <w:sz w:val="22"/>
     </w:rPr>
   </w:style>
   <w:style w:type="paragraph" w:styleId="Title">
@@ -7270,8 +7270,9 @@
       <w:jc w:val="center"/>
     </w:pPr>
     <w:rPr>
-      <w:rFonts w:asciiTheme="majorHAnsi" w:eastAsiaTheme="majorEastAsia" w:hAnsiTheme="majorHAnsi" w:cstheme="majorBidi" w:ascii="Times New Roman" w:hAnsi="Times New Roman"/>
-      <w:sz w:val="40"/>
+      <w:rFonts w:ascii="Times New Roman" w:hAnsi="Times New Roman" w:cs="Times New Roman" w:eastAsia="Times New Roman"/>
+      <w:b/>
+      <w:sz w:val="36"/>
       <w:szCs w:val="56"/>
     </w:rPr>
   </w:style>
@@ -7331,8 +7332,8 @@
       <w:keepLines/>
     </w:pPr>
     <w:rPr>
-      <w:rFonts w:ascii="Times New Roman" w:hAnsi="Times New Roman"/>
-      <w:sz w:val="22"/>
+      <w:rFonts w:ascii="Times New Roman" w:hAnsi="Times New Roman" w:cs="Times New Roman" w:eastAsia="Times New Roman"/>
+      <w:sz w:val="24"/>
       <w:szCs w:val="24"/>
     </w:rPr>
   </w:style>
@@ -7378,8 +7379,8 @@
       <w:spacing w:before="100" w:after="300"/>
     </w:pPr>
     <w:rPr>
-      <w:rFonts w:ascii="Times New Roman" w:hAnsi="Times New Roman"/>
-      <w:sz w:val="18"/>
+      <w:rFonts w:ascii="Times New Roman" w:hAnsi="Times New Roman" w:cs="Times New Roman" w:eastAsia="Times New Roman"/>
+      <w:sz w:val="24"/>
       <w:szCs w:val="20"/>
     </w:rPr>
   </w:style>
@@ -7390,8 +7391,8 @@
     <w:qFormat/>
     <w:pPr/>
     <w:rPr>
-      <w:rFonts w:ascii="Times New Roman" w:hAnsi="Times New Roman"/>
-      <w:sz w:val="17"/>
+      <w:rFonts w:ascii="Times New Roman" w:hAnsi="Times New Roman" w:cs="Times New Roman" w:eastAsia="Times New Roman"/>
+      <w:sz w:val="22"/>
     </w:rPr>
   </w:style>
   <w:style w:type="paragraph" w:styleId="Heading1">
@@ -7409,9 +7410,9 @@
       <w:outlineLvl w:val="0"/>
     </w:pPr>
     <w:rPr>
-      <w:rFonts w:asciiTheme="majorHAnsi" w:eastAsiaTheme="majorEastAsia" w:hAnsiTheme="majorHAnsi" w:cstheme="majorBidi" w:ascii="Times New Roman" w:hAnsi="Times New Roman"/>
+      <w:rFonts w:ascii="Times New Roman" w:hAnsi="Times New Roman" w:cs="Times New Roman" w:eastAsia="Times New Roman"/>
       <w:b/>
-      <w:sz w:val="24"/>
+      <w:sz w:val="28"/>
       <w:szCs w:val="40"/>
     </w:rPr>
   </w:style>
@@ -7432,9 +7433,9 @@
       <w:outlineLvl w:val="1"/>
     </w:pPr>
     <w:rPr>
-      <w:rFonts w:asciiTheme="majorHAnsi" w:eastAsiaTheme="majorEastAsia" w:hAnsiTheme="majorHAnsi" w:cstheme="majorBidi" w:ascii="Times New Roman" w:hAnsi="Times New Roman"/>
+      <w:rFonts w:ascii="Times New Roman" w:hAnsi="Times New Roman" w:cs="Times New Roman" w:eastAsia="Times New Roman"/>
       <w:b/>
-      <w:sz w:val="21"/>
+      <w:sz w:val="24"/>
       <w:szCs w:val="32"/>
     </w:rPr>
   </w:style>
@@ -7455,9 +7456,9 @@
       <w:outlineLvl w:val="2"/>
     </w:pPr>
     <w:rPr>
-      <w:rFonts w:eastAsiaTheme="majorEastAsia" w:cstheme="majorBidi" w:ascii="Times New Roman" w:hAnsi="Times New Roman"/>
+      <w:rFonts w:ascii="Times New Roman" w:hAnsi="Times New Roman" w:cs="Times New Roman" w:eastAsia="Times New Roman"/>
       <w:b/>
-      <w:sz w:val="20"/>
+      <w:sz w:val="24"/>
       <w:szCs w:val="28"/>
     </w:rPr>
   </w:style>
@@ -7796,9 +7797,9 @@
       <w:spacing w:before="0" w:after="120"/>
     </w:pPr>
     <w:rPr>
-      <w:rFonts w:ascii="Times New Roman" w:hAnsi="Times New Roman"/>
+      <w:rFonts w:ascii="Times New Roman" w:hAnsi="Times New Roman" w:cs="Times New Roman" w:eastAsia="Times New Roman"/>
       <w:i/>
-      <w:sz w:val="17"/>
+      <w:sz w:val="20"/>
     </w:rPr>
   </w:style>
   <w:style w:type="paragraph" w:customStyle="1" w:styleId="TableCaption">
@@ -7808,16 +7809,16 @@
       <w:keepNext/>
     </w:pPr>
     <w:rPr>
-      <w:rFonts w:ascii="Times New Roman" w:hAnsi="Times New Roman"/>
-      <w:sz w:val="17"/>
+      <w:rFonts w:ascii="Times New Roman" w:hAnsi="Times New Roman" w:cs="Times New Roman" w:eastAsia="Times New Roman"/>
+      <w:sz w:val="20"/>
     </w:rPr>
   </w:style>
   <w:style w:type="paragraph" w:customStyle="1" w:styleId="ImageCaption">
     <w:name w:val="Image Caption"/>
     <w:basedOn w:val="Caption"/>
     <w:rPr>
-      <w:rFonts w:ascii="Times New Roman" w:hAnsi="Times New Roman"/>
-      <w:sz w:val="17"/>
+      <w:rFonts w:ascii="Times New Roman" w:hAnsi="Times New Roman" w:cs="Times New Roman" w:eastAsia="Times New Roman"/>
+      <w:sz w:val="20"/>
     </w:rPr>
   </w:style>
   <w:style w:type="paragraph" w:customStyle="1" w:styleId="Figure">

</xml_diff>

<commit_message>
Paper: add guides (Rajesh Bhise, Laxman Buddhewad); Word version exported to PDF for sending (12 pt)
</commit_message>
<xml_diff>
--- a/paper/Major_Project_Paper.docx
+++ b/paper/Major_Project_Paper.docx
@@ -22,6 +22,12 @@
       </w:pPr>
       <w:r>
         <w:t xml:space="preserve">Shlok (UAI05BTA2317), Jiya (UAI05BTA2313), Caleb (UAI05BTA2319) – BTech AI ML, Universal AI University</w:t>
+      </w:r>
+      <w:r>
+        <w:br/>
+      </w:r>
+      <w:r>
+        <w:t xml:space="preserve">Guides: Rajesh Bhise and Laxman Buddhewad</w:t>
       </w:r>
     </w:p>
     <w:p>

</xml_diff>

<commit_message>
Word/PDF paper: IEEE two-column layout (12 pt body, auto-fit tables)
</commit_message>
<xml_diff>
--- a/paper/Major_Project_Paper.docx
+++ b/paper/Major_Project_Paper.docx
@@ -139,6 +139,14 @@
     <w:p>
       <w:pPr>
         <w:pStyle w:val="FirstParagraph"/>
+        <w:jc w:val="left"/>
+        <w:sectPr>
+          <w:footnotePr>
+            <w:numRestart w:val="eachSect"/>
+          </w:footnotePr>
+          <w:pgMar w:left="1008" w:right="1008" w:top="1080" w:bottom="1080"/>
+          <w:cols w:num="1" w:space="360"/>
+        </w:sectPr>
       </w:pPr>
       <w:r>
         <w:rPr>
@@ -164,6 +172,7 @@
     <w:p>
       <w:pPr>
         <w:pStyle w:val="FirstParagraph"/>
+        <w:jc w:val="both"/>
       </w:pPr>
       <w:r>
         <w:rPr>
@@ -232,6 +241,7 @@
     <w:p>
       <w:pPr>
         <w:pStyle w:val="BodyText"/>
+        <w:jc w:val="both"/>
       </w:pPr>
       <w:r>
         <w:rPr>
@@ -350,6 +360,7 @@
     <w:p>
       <w:pPr>
         <w:pStyle w:val="BodyText"/>
+        <w:jc w:val="both"/>
       </w:pPr>
       <w:r>
         <w:rPr>
@@ -392,6 +403,7 @@
     <w:p>
       <w:pPr>
         <w:pStyle w:val="BodyText"/>
+        <w:jc w:val="both"/>
       </w:pPr>
       <w:r>
         <w:rPr>
@@ -422,6 +434,7 @@
     <w:p>
       <w:pPr>
         <w:pStyle w:val="BodyText"/>
+        <w:jc w:val="both"/>
       </w:pPr>
       <w:r>
         <w:rPr>
@@ -473,18 +486,19 @@
     <w:tbl>
       <w:tblPr>
         <w:tblStyle w:val="Table"/>
-        <w:tblW w:type="auto" w:w="0"/>
         <w:tblLook w:firstRow="1" w:lastRow="0" w:firstColumn="0" w:lastColumn="0" w:noHBand="0" w:noVBand="0" w:val="0020"/>
         <w:tblCaption w:val="TABLE I. The 14 attack types used, what the attacker changes, and the number of attacker slots in the test set (message labels)."/>
         <w:tblBorders>
           <w:top w:val="single" w:sz="8" w:space="0" w:color="000000"/>
           <w:bottom w:val="single" w:sz="8" w:space="0" w:color="000000"/>
         </w:tblBorders>
+        <w:tblW w:w="5000" w:type="pct"/>
+        <w:tblLayout w:type="autofit"/>
       </w:tblPr>
       <w:tblGrid>
-        <w:gridCol w:w="2640"/>
-        <w:gridCol w:w="2640"/>
-        <w:gridCol w:w="2640"/>
+        <w:gridCol/>
+        <w:gridCol/>
+        <w:gridCol/>
       </w:tblGrid>
       <w:tr>
         <w:trPr>
@@ -502,6 +516,9 @@
               <w:jc w:val="left"/>
             </w:pPr>
             <w:r>
+              <w:rPr>
+                <w:sz w:val="16"/>
+              </w:rPr>
               <w:t xml:space="preserve">Attack</w:t>
             </w:r>
           </w:p>
@@ -518,6 +535,9 @@
               <w:jc w:val="left"/>
             </w:pPr>
             <w:r>
+              <w:rPr>
+                <w:sz w:val="16"/>
+              </w:rPr>
               <w:t xml:space="preserve">What the attacker sends</w:t>
             </w:r>
           </w:p>
@@ -534,6 +554,9 @@
               <w:jc w:val="right"/>
             </w:pPr>
             <w:r>
+              <w:rPr>
+                <w:sz w:val="16"/>
+              </w:rPr>
               <w:t xml:space="preserve">Test slots</w:t>
             </w:r>
           </w:p>
@@ -548,6 +571,9 @@
               <w:jc w:val="left"/>
             </w:pPr>
             <w:r>
+              <w:rPr>
+                <w:sz w:val="16"/>
+              </w:rPr>
               <w:t xml:space="preserve">ConstPos</w:t>
             </w:r>
           </w:p>
@@ -560,6 +586,9 @@
               <w:jc w:val="left"/>
             </w:pPr>
             <w:r>
+              <w:rPr>
+                <w:sz w:val="16"/>
+              </w:rPr>
               <w:t xml:space="preserve">a fixed position</w:t>
             </w:r>
           </w:p>
@@ -572,6 +601,9 @@
               <w:jc w:val="right"/>
             </w:pPr>
             <w:r>
+              <w:rPr>
+                <w:sz w:val="16"/>
+              </w:rPr>
               <w:t xml:space="preserve">6,179</w:t>
             </w:r>
           </w:p>
@@ -586,6 +618,9 @@
               <w:jc w:val="left"/>
             </w:pPr>
             <w:r>
+              <w:rPr>
+                <w:sz w:val="16"/>
+              </w:rPr>
               <w:t xml:space="preserve">ConstPosOffset</w:t>
             </w:r>
           </w:p>
@@ -598,6 +633,9 @@
               <w:jc w:val="left"/>
             </w:pPr>
             <w:r>
+              <w:rPr>
+                <w:sz w:val="16"/>
+              </w:rPr>
               <w:t xml:space="preserve">true position plus a fixed offset</w:t>
             </w:r>
           </w:p>
@@ -610,6 +648,9 @@
               <w:jc w:val="right"/>
             </w:pPr>
             <w:r>
+              <w:rPr>
+                <w:sz w:val="16"/>
+              </w:rPr>
               <w:t xml:space="preserve">6,188</w:t>
             </w:r>
           </w:p>
@@ -624,6 +665,9 @@
               <w:jc w:val="left"/>
             </w:pPr>
             <w:r>
+              <w:rPr>
+                <w:sz w:val="16"/>
+              </w:rPr>
               <w:t xml:space="preserve">RandomPos</w:t>
             </w:r>
           </w:p>
@@ -636,6 +680,9 @@
               <w:jc w:val="left"/>
             </w:pPr>
             <w:r>
+              <w:rPr>
+                <w:sz w:val="16"/>
+              </w:rPr>
               <w:t xml:space="preserve">a random position each message</w:t>
             </w:r>
           </w:p>
@@ -648,6 +695,9 @@
               <w:jc w:val="right"/>
             </w:pPr>
             <w:r>
+              <w:rPr>
+                <w:sz w:val="16"/>
+              </w:rPr>
               <w:t xml:space="preserve">6,179</w:t>
             </w:r>
           </w:p>
@@ -662,6 +712,9 @@
               <w:jc w:val="left"/>
             </w:pPr>
             <w:r>
+              <w:rPr>
+                <w:sz w:val="16"/>
+              </w:rPr>
               <w:t xml:space="preserve">RandomPosOffset</w:t>
             </w:r>
           </w:p>
@@ -674,6 +727,9 @@
               <w:jc w:val="left"/>
             </w:pPr>
             <w:r>
+              <w:rPr>
+                <w:sz w:val="16"/>
+              </w:rPr>
               <w:t xml:space="preserve">true position plus a random offset</w:t>
             </w:r>
           </w:p>
@@ -686,6 +742,9 @@
               <w:jc w:val="right"/>
             </w:pPr>
             <w:r>
+              <w:rPr>
+                <w:sz w:val="16"/>
+              </w:rPr>
               <w:t xml:space="preserve">6,189</w:t>
             </w:r>
           </w:p>
@@ -700,6 +759,9 @@
               <w:jc w:val="left"/>
             </w:pPr>
             <w:r>
+              <w:rPr>
+                <w:sz w:val="16"/>
+              </w:rPr>
               <w:t xml:space="preserve">ConstSpeed</w:t>
             </w:r>
           </w:p>
@@ -712,6 +774,9 @@
               <w:jc w:val="left"/>
             </w:pPr>
             <w:r>
+              <w:rPr>
+                <w:sz w:val="16"/>
+              </w:rPr>
               <w:t xml:space="preserve">a fixed speed</w:t>
             </w:r>
           </w:p>
@@ -724,6 +789,9 @@
               <w:jc w:val="right"/>
             </w:pPr>
             <w:r>
+              <w:rPr>
+                <w:sz w:val="16"/>
+              </w:rPr>
               <w:t xml:space="preserve">6,158</w:t>
             </w:r>
           </w:p>
@@ -738,6 +806,9 @@
               <w:jc w:val="left"/>
             </w:pPr>
             <w:r>
+              <w:rPr>
+                <w:sz w:val="16"/>
+              </w:rPr>
               <w:t xml:space="preserve">ConstSpeedOffset</w:t>
             </w:r>
           </w:p>
@@ -750,6 +821,9 @@
               <w:jc w:val="left"/>
             </w:pPr>
             <w:r>
+              <w:rPr>
+                <w:sz w:val="16"/>
+              </w:rPr>
               <w:t xml:space="preserve">true speed plus a fixed offset</w:t>
             </w:r>
           </w:p>
@@ -762,6 +836,9 @@
               <w:jc w:val="right"/>
             </w:pPr>
             <w:r>
+              <w:rPr>
+                <w:sz w:val="16"/>
+              </w:rPr>
               <w:t xml:space="preserve">6,153</w:t>
             </w:r>
           </w:p>
@@ -776,6 +853,9 @@
               <w:jc w:val="left"/>
             </w:pPr>
             <w:r>
+              <w:rPr>
+                <w:sz w:val="16"/>
+              </w:rPr>
               <w:t xml:space="preserve">RandomSpeed</w:t>
             </w:r>
           </w:p>
@@ -788,6 +868,9 @@
               <w:jc w:val="left"/>
             </w:pPr>
             <w:r>
+              <w:rPr>
+                <w:sz w:val="16"/>
+              </w:rPr>
               <w:t xml:space="preserve">a random speed</w:t>
             </w:r>
           </w:p>
@@ -800,6 +883,9 @@
               <w:jc w:val="right"/>
             </w:pPr>
             <w:r>
+              <w:rPr>
+                <w:sz w:val="16"/>
+              </w:rPr>
               <w:t xml:space="preserve">6,186</w:t>
             </w:r>
           </w:p>
@@ -814,6 +900,9 @@
               <w:jc w:val="left"/>
             </w:pPr>
             <w:r>
+              <w:rPr>
+                <w:sz w:val="16"/>
+              </w:rPr>
               <w:t xml:space="preserve">EventualStop</w:t>
             </w:r>
           </w:p>
@@ -826,6 +915,9 @@
               <w:jc w:val="left"/>
             </w:pPr>
             <w:r>
+              <w:rPr>
+                <w:sz w:val="16"/>
+              </w:rPr>
               <w:t xml:space="preserve">claims to stop and stay at one position</w:t>
             </w:r>
           </w:p>
@@ -838,6 +930,9 @@
               <w:jc w:val="right"/>
             </w:pPr>
             <w:r>
+              <w:rPr>
+                <w:sz w:val="16"/>
+              </w:rPr>
               <w:t xml:space="preserve">4,556</w:t>
             </w:r>
           </w:p>
@@ -852,6 +947,9 @@
               <w:jc w:val="left"/>
             </w:pPr>
             <w:r>
+              <w:rPr>
+                <w:sz w:val="16"/>
+              </w:rPr>
               <w:t xml:space="preserve">Disruptive</w:t>
             </w:r>
           </w:p>
@@ -864,6 +962,9 @@
               <w:jc w:val="left"/>
             </w:pPr>
             <w:r>
+              <w:rPr>
+                <w:sz w:val="16"/>
+              </w:rPr>
               <w:t xml:space="preserve">content of other vehicles’ messages</w:t>
             </w:r>
           </w:p>
@@ -876,6 +977,9 @@
               <w:jc w:val="right"/>
             </w:pPr>
             <w:r>
+              <w:rPr>
+                <w:sz w:val="16"/>
+              </w:rPr>
               <w:t xml:space="preserve">6,169</w:t>
             </w:r>
           </w:p>
@@ -890,6 +994,9 @@
               <w:jc w:val="left"/>
             </w:pPr>
             <w:r>
+              <w:rPr>
+                <w:sz w:val="16"/>
+              </w:rPr>
               <w:t xml:space="preserve">DataReplay</w:t>
             </w:r>
           </w:p>
@@ -902,6 +1009,9 @@
               <w:jc w:val="left"/>
             </w:pPr>
             <w:r>
+              <w:rPr>
+                <w:sz w:val="16"/>
+              </w:rPr>
               <w:t xml:space="preserve">replays another vehicle’s messages</w:t>
             </w:r>
           </w:p>
@@ -914,6 +1024,9 @@
               <w:jc w:val="right"/>
             </w:pPr>
             <w:r>
+              <w:rPr>
+                <w:sz w:val="16"/>
+              </w:rPr>
               <w:t xml:space="preserve">6,175</w:t>
             </w:r>
           </w:p>
@@ -928,6 +1041,9 @@
               <w:jc w:val="left"/>
             </w:pPr>
             <w:r>
+              <w:rPr>
+                <w:sz w:val="16"/>
+              </w:rPr>
               <w:t xml:space="preserve">DelayedMessages</w:t>
             </w:r>
           </w:p>
@@ -940,6 +1056,9 @@
               <w:jc w:val="left"/>
             </w:pPr>
             <w:r>
+              <w:rPr>
+                <w:sz w:val="16"/>
+              </w:rPr>
               <w:t xml:space="preserve">its own messages, delayed</w:t>
             </w:r>
           </w:p>
@@ -952,6 +1071,9 @@
               <w:jc w:val="right"/>
             </w:pPr>
             <w:r>
+              <w:rPr>
+                <w:sz w:val="16"/>
+              </w:rPr>
               <w:t xml:space="preserve">6,179</w:t>
             </w:r>
           </w:p>
@@ -966,6 +1088,9 @@
               <w:jc w:val="left"/>
             </w:pPr>
             <w:r>
+              <w:rPr>
+                <w:sz w:val="16"/>
+              </w:rPr>
               <w:t xml:space="preserve">DoS</w:t>
             </w:r>
           </w:p>
@@ -978,6 +1103,9 @@
               <w:jc w:val="left"/>
             </w:pPr>
             <w:r>
+              <w:rPr>
+                <w:sz w:val="16"/>
+              </w:rPr>
               <w:t xml:space="preserve">true content at a much higher rate</w:t>
             </w:r>
           </w:p>
@@ -990,6 +1118,9 @@
               <w:jc w:val="right"/>
             </w:pPr>
             <w:r>
+              <w:rPr>
+                <w:sz w:val="16"/>
+              </w:rPr>
               <w:t xml:space="preserve">6,401</w:t>
             </w:r>
           </w:p>
@@ -1004,6 +1135,9 @@
               <w:jc w:val="left"/>
             </w:pPr>
             <w:r>
+              <w:rPr>
+                <w:sz w:val="16"/>
+              </w:rPr>
               <w:t xml:space="preserve">DoSRandom</w:t>
             </w:r>
           </w:p>
@@ -1016,6 +1150,9 @@
               <w:jc w:val="left"/>
             </w:pPr>
             <w:r>
+              <w:rPr>
+                <w:sz w:val="16"/>
+              </w:rPr>
               <w:t xml:space="preserve">random content at a high rate</w:t>
             </w:r>
           </w:p>
@@ -1028,6 +1165,9 @@
               <w:jc w:val="right"/>
             </w:pPr>
             <w:r>
+              <w:rPr>
+                <w:sz w:val="16"/>
+              </w:rPr>
               <w:t xml:space="preserve">6,402</w:t>
             </w:r>
           </w:p>
@@ -1042,6 +1182,9 @@
               <w:jc w:val="left"/>
             </w:pPr>
             <w:r>
+              <w:rPr>
+                <w:sz w:val="16"/>
+              </w:rPr>
               <w:t xml:space="preserve">DoSDisruptive</w:t>
             </w:r>
           </w:p>
@@ -1054,6 +1197,9 @@
               <w:jc w:val="left"/>
             </w:pPr>
             <w:r>
+              <w:rPr>
+                <w:sz w:val="16"/>
+              </w:rPr>
               <w:t xml:space="preserve">others’ content at a high rate</w:t>
             </w:r>
           </w:p>
@@ -1066,6 +1212,9 @@
               <w:jc w:val="right"/>
             </w:pPr>
             <w:r>
+              <w:rPr>
+                <w:sz w:val="16"/>
+              </w:rPr>
               <w:t xml:space="preserve">6,407</w:t>
             </w:r>
           </w:p>
@@ -1076,6 +1225,7 @@
     <w:p>
       <w:pPr>
         <w:pStyle w:val="FirstParagraph"/>
+        <w:jc w:val="both"/>
       </w:pPr>
       <w:r>
         <w:rPr>
@@ -1125,6 +1275,7 @@
     <w:p>
       <w:pPr>
         <w:pStyle w:val="FirstParagraph"/>
+        <w:jc w:val="both"/>
       </w:pPr>
       <w:r>
         <w:rPr>
@@ -1161,6 +1312,7 @@
     <w:p>
       <w:pPr>
         <w:pStyle w:val="BodyText"/>
+        <w:jc w:val="both"/>
       </w:pPr>
       <w:r>
         <w:rPr>
@@ -1185,6 +1337,7 @@
     <w:p>
       <w:pPr>
         <w:pStyle w:val="BodyText"/>
+        <w:jc w:val="both"/>
       </w:pPr>
       <w:r>
         <w:rPr>
@@ -1215,6 +1368,7 @@
     <w:p>
       <w:pPr>
         <w:pStyle w:val="BodyText"/>
+        <w:jc w:val="both"/>
       </w:pPr>
       <w:r>
         <w:rPr>
@@ -1245,6 +1399,7 @@
     <w:p>
       <w:pPr>
         <w:pStyle w:val="BodyText"/>
+        <w:jc w:val="both"/>
       </w:pPr>
       <w:r>
         <w:rPr>
@@ -1263,6 +1418,7 @@
     <w:p>
       <w:pPr>
         <w:pStyle w:val="BodyText"/>
+        <w:jc w:val="both"/>
       </w:pPr>
       <w:r>
         <w:rPr>
@@ -1299,6 +1455,7 @@
     <w:p>
       <w:pPr>
         <w:pStyle w:val="BodyText"/>
+        <w:jc w:val="both"/>
       </w:pPr>
       <w:r>
         <w:rPr>
@@ -1339,6 +1496,7 @@
     <w:p>
       <w:pPr>
         <w:pStyle w:val="FirstParagraph"/>
+        <w:jc w:val="both"/>
       </w:pPr>
       <w:r>
         <w:t xml:space="preserve">Fig. 1 shows the pipeline. Raw messages heard by a receiver are grouped into windows, each claim is checked for plausibility,</w:t>
@@ -1359,7 +1517,7 @@
       <w:r>
         <w:drawing>
           <wp:inline>
-            <wp:extent cx="3108960" cy="1277148"/>
+            <wp:extent cx="3017520" cy="1239584"/>
             <wp:effectExtent b="0" l="0" r="0" t="0"/>
             <wp:docPr descr="" title="" id="14" name="Picture"/>
             <a:graphic>
@@ -1380,7 +1538,7 @@
                   <pic:spPr bwMode="auto">
                     <a:xfrm>
                       <a:off x="0" y="0"/>
-                      <a:ext cx="3108960" cy="1277148"/>
+                      <a:ext cx="3017520" cy="1239584"/>
                     </a:xfrm>
                     <a:prstGeom prst="rect">
                       <a:avLst/>
@@ -1421,6 +1579,7 @@
     <w:p>
       <w:pPr>
         <w:pStyle w:val="FirstParagraph"/>
+        <w:jc w:val="both"/>
       </w:pPr>
       <w:r>
         <w:t xml:space="preserve">Per sender and step we keep the raw claim: position, speed, heading,</w:t>
@@ -1451,6 +1610,7 @@
     <w:p>
       <w:pPr>
         <w:pStyle w:val="FirstParagraph"/>
+        <w:jc w:val="both"/>
       </w:pPr>
       <w:r>
         <w:t xml:space="preserve">For every sender and step the model receives 19 values. Nine describe the claim itself: position relative to the receiver (scaled by 300 m),</w:t>
@@ -1516,6 +1676,7 @@
           <w:ilvl w:val="0"/>
           <w:numId w:val="1001"/>
         </w:numPr>
+        <w:jc w:val="both"/>
       </w:pPr>
       <w:r>
         <w:rPr>
@@ -1906,6 +2067,7 @@
           <w:ilvl w:val="0"/>
           <w:numId w:val="1001"/>
         </w:numPr>
+        <w:jc w:val="both"/>
       </w:pPr>
       <w:r>
         <w:rPr>
@@ -1948,6 +2110,7 @@
           <w:ilvl w:val="0"/>
           <w:numId w:val="1001"/>
         </w:numPr>
+        <w:jc w:val="both"/>
       </w:pPr>
       <w:r>
         <w:rPr>
@@ -1967,6 +2130,7 @@
           <w:ilvl w:val="0"/>
           <w:numId w:val="1001"/>
         </w:numPr>
+        <w:jc w:val="both"/>
       </w:pPr>
       <w:r>
         <w:rPr>
@@ -1994,6 +2158,7 @@
     <w:p>
       <w:pPr>
         <w:pStyle w:val="FirstParagraph"/>
+        <w:jc w:val="both"/>
       </w:pPr>
       <w:r>
         <w:rPr>
@@ -2040,6 +2205,7 @@
     <w:p>
       <w:pPr>
         <w:pStyle w:val="FirstParagraph"/>
+        <w:jc w:val="both"/>
       </w:pPr>
       <w:r>
         <w:t xml:space="preserve">A factorised transformer encodes the window (Fig. 2): a linear embedding (</w:t>
@@ -2095,7 +2261,7 @@
       <w:r>
         <w:drawing>
           <wp:inline>
-            <wp:extent cx="3108960" cy="2910584"/>
+            <wp:extent cx="3017520" cy="2824978"/>
             <wp:effectExtent b="0" l="0" r="0" t="0"/>
             <wp:docPr descr="" title="" id="21" name="Picture"/>
             <a:graphic>
@@ -2116,7 +2282,7 @@
                   <pic:spPr bwMode="auto">
                     <a:xfrm>
                       <a:off x="0" y="0"/>
-                      <a:ext cx="3108960" cy="2910584"/>
+                      <a:ext cx="3017520" cy="2824978"/>
                     </a:xfrm>
                     <a:prstGeom prst="rect">
                       <a:avLst/>
@@ -2220,6 +2386,7 @@
     <w:p>
       <w:pPr>
         <w:pStyle w:val="FirstParagraph"/>
+        <w:jc w:val="both"/>
       </w:pPr>
       <w:r>
         <w:t xml:space="preserve">The benchmark’s attacks are mostly physically implausible. To teach the model consistent lies as well, we add a copy of half of the training</w:t>
@@ -2298,6 +2465,7 @@
     <w:p>
       <w:pPr>
         <w:pStyle w:val="FirstParagraph"/>
+        <w:jc w:val="both"/>
       </w:pPr>
       <w:r>
         <w:t xml:space="preserve">A receiver that has flagged a sender keeps a decaying suspicion of it:</w:t>
@@ -2441,6 +2609,7 @@
     <w:p>
       <w:pPr>
         <w:pStyle w:val="FirstParagraph"/>
+        <w:jc w:val="both"/>
       </w:pPr>
       <w:r>
         <w:t xml:space="preserve">A received message is</w:t>
@@ -2499,6 +2668,7 @@
     <w:p>
       <w:pPr>
         <w:pStyle w:val="FirstParagraph"/>
+        <w:jc w:val="both"/>
       </w:pPr>
       <w:r>
         <w:t xml:space="preserve">The detector is written in Python with PyTorch, NumPy and scikit-learn. A loader parses the VeReMi Extension logs (one JSON file per vehicle,</w:t>
@@ -2590,7 +2760,7 @@
       <w:r>
         <w:drawing>
           <wp:inline>
-            <wp:extent cx="3108960" cy="2303039"/>
+            <wp:extent cx="3017520" cy="2235302"/>
             <wp:effectExtent b="0" l="0" r="0" t="0"/>
             <wp:docPr descr="" title="" id="29" name="Picture"/>
             <a:graphic>
@@ -2611,7 +2781,7 @@
                   <pic:spPr bwMode="auto">
                     <a:xfrm>
                       <a:off x="0" y="0"/>
-                      <a:ext cx="3108960" cy="2303039"/>
+                      <a:ext cx="3017520" cy="2235302"/>
                     </a:xfrm>
                     <a:prstGeom prst="rect">
                       <a:avLst/>
@@ -2650,17 +2820,18 @@
     <w:tbl>
       <w:tblPr>
         <w:tblStyle w:val="Table"/>
-        <w:tblW w:type="auto" w:w="0"/>
         <w:tblLook w:firstRow="0" w:lastRow="0" w:firstColumn="0" w:lastColumn="0" w:noHBand="0" w:noVBand="0" w:val="0000"/>
         <w:tblCaption w:val="TABLE II. Implementation and training settings."/>
         <w:tblBorders>
           <w:top w:val="single" w:sz="8" w:space="0" w:color="000000"/>
           <w:bottom w:val="single" w:sz="8" w:space="0" w:color="000000"/>
         </w:tblBorders>
+        <w:tblW w:w="5000" w:type="pct"/>
+        <w:tblLayout w:type="autofit"/>
       </w:tblPr>
       <w:tblGrid>
-        <w:gridCol w:w="3960"/>
-        <w:gridCol w:w="3960"/>
+        <w:gridCol/>
+        <w:gridCol/>
       </w:tblGrid>
       <w:tr>
         <w:tc>
@@ -2675,6 +2846,9 @@
               <w:jc w:val="left"/>
             </w:pPr>
             <w:r>
+              <w:rPr>
+                <w:sz w:val="16"/>
+              </w:rPr>
               <w:t xml:space="preserve">Data</w:t>
             </w:r>
           </w:p>
@@ -2691,6 +2865,9 @@
               <w:jc w:val="left"/>
             </w:pPr>
             <w:r>
+              <w:rPr>
+                <w:sz w:val="16"/>
+              </w:rPr>
               <w:t xml:space="preserve">VeReMi Extension, 14 attack subsets, 14:00–16:00</w:t>
             </w:r>
           </w:p>
@@ -2705,6 +2882,9 @@
               <w:jc w:val="left"/>
             </w:pPr>
             <w:r>
+              <w:rPr>
+                <w:sz w:val="16"/>
+              </w:rPr>
               <w:t xml:space="preserve">Split</w:t>
             </w:r>
           </w:p>
@@ -2717,6 +2897,9 @@
               <w:jc w:val="left"/>
             </w:pPr>
             <w:r>
+              <w:rPr>
+                <w:sz w:val="16"/>
+              </w:rPr>
               <w:t xml:space="preserve">hour 1: train; hour 2: 30% val. / 70% test receivers</w:t>
             </w:r>
           </w:p>
@@ -2731,6 +2914,9 @@
               <w:jc w:val="left"/>
             </w:pPr>
             <w:r>
+              <w:rPr>
+                <w:sz w:val="16"/>
+              </w:rPr>
               <w:t xml:space="preserve">Windows</w:t>
             </w:r>
           </w:p>
@@ -2743,6 +2929,9 @@
               <w:jc w:val="left"/>
             </w:pPr>
             <w:r>
+              <w:rPr>
+                <w:sz w:val="16"/>
+              </w:rPr>
               <w:t xml:space="preserve">109,823 train (+39,691 lies), 29,547 val., 68,971 test</w:t>
             </w:r>
           </w:p>
@@ -2757,6 +2946,9 @@
               <w:jc w:val="left"/>
             </w:pPr>
             <w:r>
+              <w:rPr>
+                <w:sz w:val="16"/>
+              </w:rPr>
               <w:t xml:space="preserve">Window</w:t>
             </w:r>
           </w:p>
@@ -2783,9 +2975,15 @@
               </m:r>
             </m:oMath>
             <w:r>
+              <w:rPr>
+                <w:sz w:val="16"/>
+              </w:rPr>
               <w:t xml:space="preserve">,</w:t>
             </w:r>
             <w:r>
+              <w:rPr>
+                <w:sz w:val="16"/>
+              </w:rPr>
               <w:t xml:space="preserve"> </w:t>
             </w:r>
             <m:oMath>
@@ -2803,9 +3001,15 @@
               </m:r>
             </m:oMath>
             <w:r>
+              <w:rPr>
+                <w:sz w:val="16"/>
+              </w:rPr>
               <w:t xml:space="preserve"> </w:t>
             </w:r>
             <w:r>
+              <w:rPr>
+                <w:sz w:val="16"/>
+              </w:rPr>
               <w:t xml:space="preserve">steps of 1 s, stride 3 s, 250 receivers/slice</w:t>
             </w:r>
           </w:p>
@@ -2820,6 +3024,9 @@
               <w:jc w:val="left"/>
             </w:pPr>
             <w:r>
+              <w:rPr>
+                <w:sz w:val="16"/>
+              </w:rPr>
               <w:t xml:space="preserve">Inputs</w:t>
             </w:r>
           </w:p>
@@ -2832,6 +3039,9 @@
               <w:jc w:val="left"/>
             </w:pPr>
             <w:r>
+              <w:rPr>
+                <w:sz w:val="16"/>
+              </w:rPr>
               <w:t xml:space="preserve">19 per sender and step (9 claim values, 10 checks)</w:t>
             </w:r>
           </w:p>
@@ -2846,6 +3056,9 @@
               <w:jc w:val="left"/>
             </w:pPr>
             <w:r>
+              <w:rPr>
+                <w:sz w:val="16"/>
+              </w:rPr>
               <w:t xml:space="preserve">Road map</w:t>
             </w:r>
           </w:p>
@@ -2858,6 +3071,9 @@
               <w:jc w:val="left"/>
             </w:pPr>
             <w:r>
+              <w:rPr>
+                <w:sz w:val="16"/>
+              </w:rPr>
               <w:t xml:space="preserve">5 m grid, 675</w:t>
             </w:r>
             <m:oMath>
@@ -2869,6 +3085,9 @@
               </m:r>
             </m:oMath>
             <w:r>
+              <w:rPr>
+                <w:sz w:val="16"/>
+              </w:rPr>
               <w:t xml:space="preserve">667 cells, own positions (hour 1)</w:t>
             </w:r>
           </w:p>
@@ -2883,6 +3102,9 @@
               <w:jc w:val="left"/>
             </w:pPr>
             <w:r>
+              <w:rPr>
+                <w:sz w:val="16"/>
+              </w:rPr>
               <w:t xml:space="preserve">Model</w:t>
             </w:r>
           </w:p>
@@ -2895,9 +3117,15 @@
               <w:jc w:val="left"/>
             </w:pPr>
             <w:r>
+              <w:rPr>
+                <w:sz w:val="16"/>
+              </w:rPr>
               <w:t xml:space="preserve">transformer,</w:t>
             </w:r>
             <w:r>
+              <w:rPr>
+                <w:sz w:val="16"/>
+              </w:rPr>
               <w:t xml:space="preserve"> </w:t>
             </w:r>
             <m:oMath>
@@ -2915,6 +3143,9 @@
               </m:r>
             </m:oMath>
             <w:r>
+              <w:rPr>
+                <w:sz w:val="16"/>
+              </w:rPr>
               <w:t xml:space="preserve">, 4 heads, 2 blocks, 144k parameters</w:t>
             </w:r>
           </w:p>
@@ -2929,6 +3160,9 @@
               <w:jc w:val="left"/>
             </w:pPr>
             <w:r>
+              <w:rPr>
+                <w:sz w:val="16"/>
+              </w:rPr>
               <w:t xml:space="preserve">Loss</w:t>
             </w:r>
           </w:p>
@@ -2941,6 +3175,9 @@
               <w:jc w:val="left"/>
             </w:pPr>
             <w:r>
+              <w:rPr>
+                <w:sz w:val="16"/>
+              </w:rPr>
               <w:t xml:space="preserve">weighted BCE (positive weight 2), batch 128, 8 epochs</w:t>
             </w:r>
           </w:p>
@@ -2955,6 +3192,9 @@
               <w:jc w:val="left"/>
             </w:pPr>
             <w:r>
+              <w:rPr>
+                <w:sz w:val="16"/>
+              </w:rPr>
               <w:t xml:space="preserve">Optimiser</w:t>
             </w:r>
           </w:p>
@@ -2967,9 +3207,15 @@
               <w:jc w:val="left"/>
             </w:pPr>
             <w:r>
+              <w:rPr>
+                <w:sz w:val="16"/>
+              </w:rPr>
               <w:t xml:space="preserve">AdamW, lr</w:t>
             </w:r>
             <w:r>
+              <w:rPr>
+                <w:sz w:val="16"/>
+              </w:rPr>
               <w:t xml:space="preserve"> </w:t>
             </w:r>
             <m:oMath>
@@ -3002,9 +3248,15 @@
               </m:sSup>
             </m:oMath>
             <w:r>
+              <w:rPr>
+                <w:sz w:val="16"/>
+              </w:rPr>
               <w:t xml:space="preserve">, weight decay</w:t>
             </w:r>
             <w:r>
+              <w:rPr>
+                <w:sz w:val="16"/>
+              </w:rPr>
               <w:t xml:space="preserve"> </w:t>
             </w:r>
             <m:oMath>
@@ -3028,6 +3280,9 @@
               </m:sSup>
             </m:oMath>
             <w:r>
+              <w:rPr>
+                <w:sz w:val="16"/>
+              </w:rPr>
               <w:t xml:space="preserve">, one-cycle</w:t>
             </w:r>
           </w:p>
@@ -3042,6 +3297,9 @@
               <w:jc w:val="left"/>
             </w:pPr>
             <w:r>
+              <w:rPr>
+                <w:sz w:val="16"/>
+              </w:rPr>
               <w:t xml:space="preserve">Hardware</w:t>
             </w:r>
           </w:p>
@@ -3054,6 +3312,9 @@
               <w:jc w:val="left"/>
             </w:pPr>
             <w:r>
+              <w:rPr>
+                <w:sz w:val="16"/>
+              </w:rPr>
               <w:t xml:space="preserve">laptop RTX 3050 Ti (4 GB), 16 GB RAM; 10–15 min each</w:t>
             </w:r>
           </w:p>
@@ -3068,6 +3329,9 @@
               <w:jc w:val="left"/>
             </w:pPr>
             <w:r>
+              <w:rPr>
+                <w:sz w:val="16"/>
+              </w:rPr>
               <w:t xml:space="preserve">Software</w:t>
             </w:r>
           </w:p>
@@ -3080,6 +3344,9 @@
               <w:jc w:val="left"/>
             </w:pPr>
             <w:r>
+              <w:rPr>
+                <w:sz w:val="16"/>
+              </w:rPr>
               <w:t xml:space="preserve">Python 3.12, PyTorch 2.5, NumPy, scikit-learn</w:t>
             </w:r>
           </w:p>
@@ -3094,6 +3361,9 @@
               <w:jc w:val="left"/>
             </w:pPr>
             <w:r>
+              <w:rPr>
+                <w:sz w:val="16"/>
+              </w:rPr>
               <w:t xml:space="preserve">Seeds</w:t>
             </w:r>
           </w:p>
@@ -3106,6 +3376,9 @@
               <w:jc w:val="left"/>
             </w:pPr>
             <w:r>
+              <w:rPr>
+                <w:sz w:val="16"/>
+              </w:rPr>
               <w:t xml:space="preserve">2 per model; threshold and memory decay from validation</w:t>
             </w:r>
           </w:p>
@@ -3120,6 +3393,9 @@
               <w:jc w:val="left"/>
             </w:pPr>
             <w:r>
+              <w:rPr>
+                <w:sz w:val="16"/>
+              </w:rPr>
               <w:t xml:space="preserve">18 attacks</w:t>
             </w:r>
           </w:p>
@@ -3132,9 +3408,15 @@
               <w:jc w:val="left"/>
             </w:pPr>
             <w:r>
+              <w:rPr>
+                <w:sz w:val="16"/>
+              </w:rPr>
               <w:t xml:space="preserve">mean of both and a</w:t>
             </w:r>
             <w:r>
+              <w:rPr>
+                <w:sz w:val="16"/>
+              </w:rPr>
               <w:t xml:space="preserve"> </w:t>
             </w:r>
             <m:oMath>
@@ -3152,6 +3434,9 @@
               </m:r>
             </m:oMath>
             <w:r>
+              <w:rPr>
+                <w:sz w:val="16"/>
+              </w:rPr>
               <w:t xml:space="preserve">, 3-block model (470k, 16 ep.)</w:t>
             </w:r>
           </w:p>
@@ -3172,6 +3457,7 @@
     <w:p>
       <w:pPr>
         <w:pStyle w:val="FirstParagraph"/>
+        <w:jc w:val="both"/>
       </w:pPr>
       <w:r>
         <w:rPr>
@@ -3255,22 +3541,23 @@
     <w:tbl>
       <w:tblPr>
         <w:tblStyle w:val="Table"/>
-        <w:tblW w:type="auto" w:w="0"/>
         <w:tblLook w:firstRow="1" w:lastRow="0" w:firstColumn="0" w:lastColumn="0" w:noHBand="0" w:noVBand="0" w:val="0020"/>
         <w:tblCaption w:val="TABLE III. VeReMi Extension, 14 attack types, 68,971 test windows, mean of 2 seeds (%). Message labels count an attacker as positive only in windows where it sent a falsified message (ground truth); vehicle labels count every window of an attacker vehicle. Thresholds and memory decay are picked on validation. Reference: 97.37% reported for VeReMi (original, 5 attacks) in the survey of Abdel Hakeem and Kim (2025)."/>
         <w:tblBorders>
           <w:top w:val="single" w:sz="8" w:space="0" w:color="000000"/>
           <w:bottom w:val="single" w:sz="8" w:space="0" w:color="000000"/>
         </w:tblBorders>
+        <w:tblW w:w="5000" w:type="pct"/>
+        <w:tblLayout w:type="autofit"/>
       </w:tblPr>
       <w:tblGrid>
-        <w:gridCol w:w="1131"/>
-        <w:gridCol w:w="1131"/>
-        <w:gridCol w:w="1131"/>
-        <w:gridCol w:w="1131"/>
-        <w:gridCol w:w="1131"/>
-        <w:gridCol w:w="1131"/>
-        <w:gridCol w:w="1131"/>
+        <w:gridCol/>
+        <w:gridCol/>
+        <w:gridCol/>
+        <w:gridCol/>
+        <w:gridCol/>
+        <w:gridCol/>
+        <w:gridCol/>
       </w:tblGrid>
       <w:tr>
         <w:trPr>
@@ -3288,6 +3575,9 @@
               <w:jc w:val="left"/>
             </w:pPr>
             <w:r>
+              <w:rPr>
+                <w:sz w:val="16"/>
+              </w:rPr>
               <w:t xml:space="preserve">Labels</w:t>
             </w:r>
           </w:p>
@@ -3304,6 +3594,9 @@
               <w:jc w:val="left"/>
             </w:pPr>
             <w:r>
+              <w:rPr>
+                <w:sz w:val="16"/>
+              </w:rPr>
               <w:t xml:space="preserve">Model</w:t>
             </w:r>
           </w:p>
@@ -3320,6 +3613,9 @@
               <w:jc w:val="center"/>
             </w:pPr>
             <w:r>
+              <w:rPr>
+                <w:sz w:val="16"/>
+              </w:rPr>
               <w:t xml:space="preserve">Precision</w:t>
             </w:r>
           </w:p>
@@ -3336,6 +3632,9 @@
               <w:jc w:val="center"/>
             </w:pPr>
             <w:r>
+              <w:rPr>
+                <w:sz w:val="16"/>
+              </w:rPr>
               <w:t xml:space="preserve">Recall</w:t>
             </w:r>
           </w:p>
@@ -3352,6 +3651,9 @@
               <w:jc w:val="center"/>
             </w:pPr>
             <w:r>
+              <w:rPr>
+                <w:sz w:val="16"/>
+              </w:rPr>
               <w:t xml:space="preserve">F1</w:t>
             </w:r>
           </w:p>
@@ -3368,6 +3670,9 @@
               <w:jc w:val="center"/>
             </w:pPr>
             <w:r>
+              <w:rPr>
+                <w:sz w:val="16"/>
+              </w:rPr>
               <w:t xml:space="preserve">Accuracy</w:t>
             </w:r>
           </w:p>
@@ -3384,6 +3689,9 @@
               <w:jc w:val="center"/>
             </w:pPr>
             <w:r>
+              <w:rPr>
+                <w:sz w:val="16"/>
+              </w:rPr>
               <w:t xml:space="preserve">FPR</w:t>
             </w:r>
           </w:p>
@@ -3398,6 +3706,9 @@
               <w:jc w:val="left"/>
             </w:pPr>
             <w:r>
+              <w:rPr>
+                <w:sz w:val="16"/>
+              </w:rPr>
               <w:t xml:space="preserve">message</w:t>
             </w:r>
           </w:p>
@@ -3410,6 +3721,9 @@
               <w:jc w:val="left"/>
             </w:pPr>
             <w:r>
+              <w:rPr>
+                <w:sz w:val="16"/>
+              </w:rPr>
               <w:t xml:space="preserve">Ours</w:t>
             </w:r>
           </w:p>
@@ -3422,6 +3736,9 @@
               <w:jc w:val="center"/>
             </w:pPr>
             <w:r>
+              <w:rPr>
+                <w:sz w:val="16"/>
+              </w:rPr>
               <w:t xml:space="preserve">98.65</w:t>
             </w:r>
           </w:p>
@@ -3434,6 +3751,9 @@
               <w:jc w:val="center"/>
             </w:pPr>
             <w:r>
+              <w:rPr>
+                <w:sz w:val="16"/>
+              </w:rPr>
               <w:t xml:space="preserve">97.12</w:t>
             </w:r>
           </w:p>
@@ -3446,6 +3766,9 @@
               <w:jc w:val="center"/>
             </w:pPr>
             <w:r>
+              <w:rPr>
+                <w:sz w:val="16"/>
+              </w:rPr>
               <w:t xml:space="preserve">97.88</w:t>
             </w:r>
           </w:p>
@@ -3458,6 +3781,9 @@
               <w:jc w:val="center"/>
             </w:pPr>
             <w:r>
+              <w:rPr>
+                <w:sz w:val="16"/>
+              </w:rPr>
               <w:t xml:space="preserve">98.69</w:t>
             </w:r>
           </w:p>
@@ -3470,6 +3796,9 @@
               <w:jc w:val="center"/>
             </w:pPr>
             <w:r>
+              <w:rPr>
+                <w:sz w:val="16"/>
+              </w:rPr>
               <w:t xml:space="preserve">0.60</w:t>
             </w:r>
           </w:p>
@@ -3484,6 +3813,9 @@
               <w:jc w:val="left"/>
             </w:pPr>
             <w:r>
+              <w:rPr>
+                <w:sz w:val="16"/>
+              </w:rPr>
               <w:t xml:space="preserve">message</w:t>
             </w:r>
           </w:p>
@@ -3496,6 +3828,9 @@
               <w:jc w:val="left"/>
             </w:pPr>
             <w:r>
+              <w:rPr>
+                <w:sz w:val="16"/>
+              </w:rPr>
               <w:t xml:space="preserve">No nbr. attention</w:t>
             </w:r>
           </w:p>
@@ -3508,6 +3843,9 @@
               <w:jc w:val="center"/>
             </w:pPr>
             <w:r>
+              <w:rPr>
+                <w:sz w:val="16"/>
+              </w:rPr>
               <w:t xml:space="preserve">97.99</w:t>
             </w:r>
           </w:p>
@@ -3520,6 +3858,9 @@
               <w:jc w:val="center"/>
             </w:pPr>
             <w:r>
+              <w:rPr>
+                <w:sz w:val="16"/>
+              </w:rPr>
               <w:t xml:space="preserve">97.11</w:t>
             </w:r>
           </w:p>
@@ -3532,6 +3873,9 @@
               <w:jc w:val="center"/>
             </w:pPr>
             <w:r>
+              <w:rPr>
+                <w:sz w:val="16"/>
+              </w:rPr>
               <w:t xml:space="preserve">97.54</w:t>
             </w:r>
           </w:p>
@@ -3544,6 +3888,9 @@
               <w:jc w:val="center"/>
             </w:pPr>
             <w:r>
+              <w:rPr>
+                <w:sz w:val="16"/>
+              </w:rPr>
               <w:t xml:space="preserve">98.48</w:t>
             </w:r>
           </w:p>
@@ -3556,6 +3903,9 @@
               <w:jc w:val="center"/>
             </w:pPr>
             <w:r>
+              <w:rPr>
+                <w:sz w:val="16"/>
+              </w:rPr>
               <w:t xml:space="preserve">0.90</w:t>
             </w:r>
           </w:p>
@@ -3570,6 +3920,9 @@
               <w:jc w:val="left"/>
             </w:pPr>
             <w:r>
+              <w:rPr>
+                <w:sz w:val="16"/>
+              </w:rPr>
               <w:t xml:space="preserve">message</w:t>
             </w:r>
           </w:p>
@@ -3582,6 +3935,9 @@
               <w:jc w:val="left"/>
             </w:pPr>
             <w:r>
+              <w:rPr>
+                <w:sz w:val="16"/>
+              </w:rPr>
               <w:t xml:space="preserve">No lie augm.</w:t>
             </w:r>
           </w:p>
@@ -3594,6 +3950,9 @@
               <w:jc w:val="center"/>
             </w:pPr>
             <w:r>
+              <w:rPr>
+                <w:sz w:val="16"/>
+              </w:rPr>
               <w:t xml:space="preserve">98.75</w:t>
             </w:r>
           </w:p>
@@ -3606,6 +3965,9 @@
               <w:jc w:val="center"/>
             </w:pPr>
             <w:r>
+              <w:rPr>
+                <w:sz w:val="16"/>
+              </w:rPr>
               <w:t xml:space="preserve">97.39</w:t>
             </w:r>
           </w:p>
@@ -3618,6 +3980,9 @@
               <w:jc w:val="center"/>
             </w:pPr>
             <w:r>
+              <w:rPr>
+                <w:sz w:val="16"/>
+              </w:rPr>
               <w:t xml:space="preserve">98.07</w:t>
             </w:r>
           </w:p>
@@ -3630,6 +3995,9 @@
               <w:jc w:val="center"/>
             </w:pPr>
             <w:r>
+              <w:rPr>
+                <w:sz w:val="16"/>
+              </w:rPr>
               <w:t xml:space="preserve">98.80</w:t>
             </w:r>
           </w:p>
@@ -3642,6 +4010,9 @@
               <w:jc w:val="center"/>
             </w:pPr>
             <w:r>
+              <w:rPr>
+                <w:sz w:val="16"/>
+              </w:rPr>
               <w:t xml:space="preserve">0.56</w:t>
             </w:r>
           </w:p>
@@ -3656,6 +4027,9 @@
               <w:jc w:val="left"/>
             </w:pPr>
             <w:r>
+              <w:rPr>
+                <w:sz w:val="16"/>
+              </w:rPr>
               <w:t xml:space="preserve">message</w:t>
             </w:r>
           </w:p>
@@ -3668,6 +4042,9 @@
               <w:jc w:val="left"/>
             </w:pPr>
             <w:r>
+              <w:rPr>
+                <w:sz w:val="16"/>
+              </w:rPr>
               <w:t xml:space="preserve">Ours + memory</w:t>
             </w:r>
           </w:p>
@@ -3680,6 +4057,9 @@
               <w:jc w:val="center"/>
             </w:pPr>
             <w:r>
+              <w:rPr>
+                <w:sz w:val="16"/>
+              </w:rPr>
               <w:t xml:space="preserve">98.16</w:t>
             </w:r>
           </w:p>
@@ -3692,6 +4072,9 @@
               <w:jc w:val="center"/>
             </w:pPr>
             <w:r>
+              <w:rPr>
+                <w:sz w:val="16"/>
+              </w:rPr>
               <w:t xml:space="preserve">97.78</w:t>
             </w:r>
           </w:p>
@@ -3704,6 +4087,9 @@
               <w:jc w:val="center"/>
             </w:pPr>
             <w:r>
+              <w:rPr>
+                <w:sz w:val="16"/>
+              </w:rPr>
               <w:t xml:space="preserve">97.97</w:t>
             </w:r>
           </w:p>
@@ -3716,6 +4102,9 @@
               <w:jc w:val="center"/>
             </w:pPr>
             <w:r>
+              <w:rPr>
+                <w:sz w:val="16"/>
+              </w:rPr>
               <w:t xml:space="preserve">98.74</w:t>
             </w:r>
           </w:p>
@@ -3728,6 +4117,9 @@
               <w:jc w:val="center"/>
             </w:pPr>
             <w:r>
+              <w:rPr>
+                <w:sz w:val="16"/>
+              </w:rPr>
               <w:t xml:space="preserve">–</w:t>
             </w:r>
           </w:p>
@@ -3742,6 +4134,9 @@
               <w:jc w:val="left"/>
             </w:pPr>
             <w:r>
+              <w:rPr>
+                <w:sz w:val="16"/>
+              </w:rPr>
               <w:t xml:space="preserve">message</w:t>
             </w:r>
           </w:p>
@@ -3754,6 +4149,9 @@
               <w:jc w:val="left"/>
             </w:pPr>
             <w:r>
+              <w:rPr>
+                <w:sz w:val="16"/>
+              </w:rPr>
               <w:t xml:space="preserve">Speed check (rule)</w:t>
             </w:r>
           </w:p>
@@ -3766,6 +4164,9 @@
               <w:jc w:val="center"/>
             </w:pPr>
             <w:r>
+              <w:rPr>
+                <w:sz w:val="16"/>
+              </w:rPr>
               <w:t xml:space="preserve">96.21</w:t>
             </w:r>
           </w:p>
@@ -3778,6 +4179,9 @@
               <w:jc w:val="center"/>
             </w:pPr>
             <w:r>
+              <w:rPr>
+                <w:sz w:val="16"/>
+              </w:rPr>
               <w:t xml:space="preserve">68.51</w:t>
             </w:r>
           </w:p>
@@ -3790,6 +4194,9 @@
               <w:jc w:val="center"/>
             </w:pPr>
             <w:r>
+              <w:rPr>
+                <w:sz w:val="16"/>
+              </w:rPr>
               <w:t xml:space="preserve">80.03</w:t>
             </w:r>
           </w:p>
@@ -3802,6 +4209,9 @@
               <w:jc w:val="center"/>
             </w:pPr>
             <w:r>
+              <w:rPr>
+                <w:sz w:val="16"/>
+              </w:rPr>
               <w:t xml:space="preserve">89.34</w:t>
             </w:r>
           </w:p>
@@ -3814,6 +4224,9 @@
               <w:jc w:val="center"/>
             </w:pPr>
             <w:r>
+              <w:rPr>
+                <w:sz w:val="16"/>
+              </w:rPr>
               <w:t xml:space="preserve">1.22</w:t>
             </w:r>
           </w:p>
@@ -3828,6 +4241,9 @@
               <w:jc w:val="left"/>
             </w:pPr>
             <w:r>
+              <w:rPr>
+                <w:sz w:val="16"/>
+              </w:rPr>
               <w:t xml:space="preserve">vehicle</w:t>
             </w:r>
           </w:p>
@@ -3840,6 +4256,9 @@
               <w:jc w:val="left"/>
             </w:pPr>
             <w:r>
+              <w:rPr>
+                <w:sz w:val="16"/>
+              </w:rPr>
               <w:t xml:space="preserve">Ours</w:t>
             </w:r>
           </w:p>
@@ -3852,6 +4271,9 @@
               <w:jc w:val="center"/>
             </w:pPr>
             <w:r>
+              <w:rPr>
+                <w:sz w:val="16"/>
+              </w:rPr>
               <w:t xml:space="preserve">98.65</w:t>
             </w:r>
           </w:p>
@@ -3864,6 +4286,9 @@
               <w:jc w:val="center"/>
             </w:pPr>
             <w:r>
+              <w:rPr>
+                <w:sz w:val="16"/>
+              </w:rPr>
               <w:t xml:space="preserve">95.41</w:t>
             </w:r>
           </w:p>
@@ -3876,6 +4301,9 @@
               <w:jc w:val="center"/>
             </w:pPr>
             <w:r>
+              <w:rPr>
+                <w:sz w:val="16"/>
+              </w:rPr>
               <w:t xml:space="preserve">97.01</w:t>
             </w:r>
           </w:p>
@@ -3888,6 +4316,9 @@
               <w:jc w:val="center"/>
             </w:pPr>
             <w:r>
+              <w:rPr>
+                <w:sz w:val="16"/>
+              </w:rPr>
               <w:t xml:space="preserve">98.14</w:t>
             </w:r>
           </w:p>
@@ -3900,6 +4331,9 @@
               <w:jc w:val="center"/>
             </w:pPr>
             <w:r>
+              <w:rPr>
+                <w:sz w:val="16"/>
+              </w:rPr>
               <w:t xml:space="preserve">0.60</w:t>
             </w:r>
           </w:p>
@@ -3914,6 +4348,9 @@
               <w:jc w:val="left"/>
             </w:pPr>
             <w:r>
+              <w:rPr>
+                <w:sz w:val="16"/>
+              </w:rPr>
               <w:t xml:space="preserve">vehicle</w:t>
             </w:r>
           </w:p>
@@ -3926,6 +4363,9 @@
               <w:jc w:val="left"/>
             </w:pPr>
             <w:r>
+              <w:rPr>
+                <w:sz w:val="16"/>
+              </w:rPr>
               <w:t xml:space="preserve">No nbr. attention</w:t>
             </w:r>
           </w:p>
@@ -3938,6 +4378,9 @@
               <w:jc w:val="center"/>
             </w:pPr>
             <w:r>
+              <w:rPr>
+                <w:sz w:val="16"/>
+              </w:rPr>
               <w:t xml:space="preserve">97.87</w:t>
             </w:r>
           </w:p>
@@ -3950,6 +4393,9 @@
               <w:jc w:val="center"/>
             </w:pPr>
             <w:r>
+              <w:rPr>
+                <w:sz w:val="16"/>
+              </w:rPr>
               <w:t xml:space="preserve">95.48</w:t>
             </w:r>
           </w:p>
@@ -3962,6 +4408,9 @@
               <w:jc w:val="center"/>
             </w:pPr>
             <w:r>
+              <w:rPr>
+                <w:sz w:val="16"/>
+              </w:rPr>
               <w:t xml:space="preserve">96.66</w:t>
             </w:r>
           </w:p>
@@ -3974,6 +4423,9 @@
               <w:jc w:val="center"/>
             </w:pPr>
             <w:r>
+              <w:rPr>
+                <w:sz w:val="16"/>
+              </w:rPr>
               <w:t xml:space="preserve">97.91</w:t>
             </w:r>
           </w:p>
@@ -3986,6 +4438,9 @@
               <w:jc w:val="center"/>
             </w:pPr>
             <w:r>
+              <w:rPr>
+                <w:sz w:val="16"/>
+              </w:rPr>
               <w:t xml:space="preserve">0.96</w:t>
             </w:r>
           </w:p>
@@ -4000,6 +4455,9 @@
               <w:jc w:val="left"/>
             </w:pPr>
             <w:r>
+              <w:rPr>
+                <w:sz w:val="16"/>
+              </w:rPr>
               <w:t xml:space="preserve">vehicle</w:t>
             </w:r>
           </w:p>
@@ -4012,6 +4470,9 @@
               <w:jc w:val="left"/>
             </w:pPr>
             <w:r>
+              <w:rPr>
+                <w:sz w:val="16"/>
+              </w:rPr>
               <w:t xml:space="preserve">No lie augm.</w:t>
             </w:r>
           </w:p>
@@ -4024,6 +4485,9 @@
               <w:jc w:val="center"/>
             </w:pPr>
             <w:r>
+              <w:rPr>
+                <w:sz w:val="16"/>
+              </w:rPr>
               <w:t xml:space="preserve">98.75</w:t>
             </w:r>
           </w:p>
@@ -4036,6 +4500,9 @@
               <w:jc w:val="center"/>
             </w:pPr>
             <w:r>
+              <w:rPr>
+                <w:sz w:val="16"/>
+              </w:rPr>
               <w:t xml:space="preserve">95.68</w:t>
             </w:r>
           </w:p>
@@ -4048,6 +4515,9 @@
               <w:jc w:val="center"/>
             </w:pPr>
             <w:r>
+              <w:rPr>
+                <w:sz w:val="16"/>
+              </w:rPr>
               <w:t xml:space="preserve">97.19</w:t>
             </w:r>
           </w:p>
@@ -4060,6 +4530,9 @@
               <w:jc w:val="center"/>
             </w:pPr>
             <w:r>
+              <w:rPr>
+                <w:sz w:val="16"/>
+              </w:rPr>
               <w:t xml:space="preserve">98.25</w:t>
             </w:r>
           </w:p>
@@ -4072,6 +4545,9 @@
               <w:jc w:val="center"/>
             </w:pPr>
             <w:r>
+              <w:rPr>
+                <w:sz w:val="16"/>
+              </w:rPr>
               <w:t xml:space="preserve">0.56</w:t>
             </w:r>
           </w:p>
@@ -4086,6 +4562,9 @@
               <w:jc w:val="left"/>
             </w:pPr>
             <w:r>
+              <w:rPr>
+                <w:sz w:val="16"/>
+              </w:rPr>
               <w:t xml:space="preserve">vehicle</w:t>
             </w:r>
           </w:p>
@@ -4098,6 +4577,9 @@
               <w:jc w:val="left"/>
             </w:pPr>
             <w:r>
+              <w:rPr>
+                <w:sz w:val="16"/>
+              </w:rPr>
               <w:t xml:space="preserve">Ours + memory</w:t>
             </w:r>
           </w:p>
@@ -4110,6 +4592,9 @@
               <w:jc w:val="center"/>
             </w:pPr>
             <w:r>
+              <w:rPr>
+                <w:sz w:val="16"/>
+              </w:rPr>
               <w:t xml:space="preserve">98.16</w:t>
             </w:r>
           </w:p>
@@ -4122,6 +4607,9 @@
               <w:jc w:val="center"/>
             </w:pPr>
             <w:r>
+              <w:rPr>
+                <w:sz w:val="16"/>
+              </w:rPr>
               <w:t xml:space="preserve">96.09</w:t>
             </w:r>
           </w:p>
@@ -4134,6 +4622,9 @@
               <w:jc w:val="center"/>
             </w:pPr>
             <w:r>
+              <w:rPr>
+                <w:sz w:val="16"/>
+              </w:rPr>
               <w:t xml:space="preserve">97.12</w:t>
             </w:r>
           </w:p>
@@ -4146,6 +4637,9 @@
               <w:jc w:val="center"/>
             </w:pPr>
             <w:r>
+              <w:rPr>
+                <w:sz w:val="16"/>
+              </w:rPr>
               <w:t xml:space="preserve">98.20</w:t>
             </w:r>
           </w:p>
@@ -4158,6 +4652,9 @@
               <w:jc w:val="center"/>
             </w:pPr>
             <w:r>
+              <w:rPr>
+                <w:sz w:val="16"/>
+              </w:rPr>
               <w:t xml:space="preserve">–</w:t>
             </w:r>
           </w:p>
@@ -4172,6 +4669,9 @@
               <w:jc w:val="left"/>
             </w:pPr>
             <w:r>
+              <w:rPr>
+                <w:sz w:val="16"/>
+              </w:rPr>
               <w:t xml:space="preserve">vehicle</w:t>
             </w:r>
           </w:p>
@@ -4184,6 +4684,9 @@
               <w:jc w:val="left"/>
             </w:pPr>
             <w:r>
+              <w:rPr>
+                <w:sz w:val="16"/>
+              </w:rPr>
               <w:t xml:space="preserve">Speed check (rule)</w:t>
             </w:r>
           </w:p>
@@ -4196,6 +4699,9 @@
               <w:jc w:val="center"/>
             </w:pPr>
             <w:r>
+              <w:rPr>
+                <w:sz w:val="16"/>
+              </w:rPr>
               <w:t xml:space="preserve">95.64</w:t>
             </w:r>
           </w:p>
@@ -4208,6 +4714,9 @@
               <w:jc w:val="center"/>
             </w:pPr>
             <w:r>
+              <w:rPr>
+                <w:sz w:val="16"/>
+              </w:rPr>
               <w:t xml:space="preserve">67.21</w:t>
             </w:r>
           </w:p>
@@ -4220,6 +4729,9 @@
               <w:jc w:val="center"/>
             </w:pPr>
             <w:r>
+              <w:rPr>
+                <w:sz w:val="16"/>
+              </w:rPr>
               <w:t xml:space="preserve">78.94</w:t>
             </w:r>
           </w:p>
@@ -4232,6 +4744,9 @@
               <w:jc w:val="center"/>
             </w:pPr>
             <w:r>
+              <w:rPr>
+                <w:sz w:val="16"/>
+              </w:rPr>
               <w:t xml:space="preserve">88.67</w:t>
             </w:r>
           </w:p>
@@ -4244,6 +4759,9 @@
               <w:jc w:val="center"/>
             </w:pPr>
             <w:r>
+              <w:rPr>
+                <w:sz w:val="16"/>
+              </w:rPr>
               <w:t xml:space="preserve">1.41</w:t>
             </w:r>
           </w:p>
@@ -4278,19 +4796,20 @@
     <w:tbl>
       <w:tblPr>
         <w:tblStyle w:val="Table"/>
-        <w:tblW w:type="auto" w:w="0"/>
         <w:tblLook w:firstRow="1" w:lastRow="0" w:firstColumn="0" w:lastColumn="0" w:noHBand="0" w:noVBand="0" w:val="0020"/>
         <w:tblCaption w:val="TABLE IV. Injected consistent lies (careful: acceleration consistent, GPS-like jitter), m colluders per window, coordinated; colluder recall at a matched 1% validation FPR, mean of 2 seeds. Training saw offset and stop lies only. Before the plausibility checks both models caught at most 4% at these sizes. In the two on-road rows the last two columns are single runs (seed 0)."/>
         <w:tblBorders>
           <w:top w:val="single" w:sz="8" w:space="0" w:color="000000"/>
           <w:bottom w:val="single" w:sz="8" w:space="0" w:color="000000"/>
         </w:tblBorders>
+        <w:tblW w:w="5000" w:type="pct"/>
+        <w:tblLayout w:type="autofit"/>
       </w:tblPr>
       <w:tblGrid>
-        <w:gridCol w:w="1980"/>
-        <w:gridCol w:w="1980"/>
-        <w:gridCol w:w="1980"/>
-        <w:gridCol w:w="1980"/>
+        <w:gridCol/>
+        <w:gridCol/>
+        <w:gridCol/>
+        <w:gridCol/>
       </w:tblGrid>
       <w:tr>
         <w:trPr>
@@ -4308,6 +4827,9 @@
               <w:jc w:val="left"/>
             </w:pPr>
             <w:r>
+              <w:rPr>
+                <w:sz w:val="16"/>
+              </w:rPr>
               <w:t xml:space="preserve">Scenario</w:t>
             </w:r>
           </w:p>
@@ -4324,6 +4846,9 @@
               <w:jc w:val="center"/>
             </w:pPr>
             <w:r>
+              <w:rPr>
+                <w:sz w:val="16"/>
+              </w:rPr>
               <w:t xml:space="preserve">Ours</w:t>
             </w:r>
           </w:p>
@@ -4340,6 +4865,9 @@
               <w:jc w:val="center"/>
             </w:pPr>
             <w:r>
+              <w:rPr>
+                <w:sz w:val="16"/>
+              </w:rPr>
               <w:t xml:space="preserve">No nbr. attention</w:t>
             </w:r>
           </w:p>
@@ -4356,6 +4884,9 @@
               <w:jc w:val="center"/>
             </w:pPr>
             <w:r>
+              <w:rPr>
+                <w:sz w:val="16"/>
+              </w:rPr>
               <w:t xml:space="preserve">No lie augm.</w:t>
             </w:r>
           </w:p>
@@ -4370,9 +4901,15 @@
               <w:jc w:val="left"/>
             </w:pPr>
             <w:r>
+              <w:rPr>
+                <w:sz w:val="16"/>
+              </w:rPr>
               <w:t xml:space="preserve">Offset 50 m,</w:t>
             </w:r>
             <w:r>
+              <w:rPr>
+                <w:sz w:val="16"/>
+              </w:rPr>
               <w:t xml:space="preserve"> </w:t>
             </w:r>
             <m:oMath>
@@ -4399,6 +4936,9 @@
               <w:jc w:val="center"/>
             </w:pPr>
             <w:r>
+              <w:rPr>
+                <w:sz w:val="16"/>
+              </w:rPr>
               <w:t xml:space="preserve">0.85</w:t>
             </w:r>
           </w:p>
@@ -4411,6 +4951,9 @@
               <w:jc w:val="center"/>
             </w:pPr>
             <w:r>
+              <w:rPr>
+                <w:sz w:val="16"/>
+              </w:rPr>
               <w:t xml:space="preserve">0.83</w:t>
             </w:r>
           </w:p>
@@ -4423,6 +4966,9 @@
               <w:jc w:val="center"/>
             </w:pPr>
             <w:r>
+              <w:rPr>
+                <w:sz w:val="16"/>
+              </w:rPr>
               <w:t xml:space="preserve">0.81</w:t>
             </w:r>
           </w:p>
@@ -4437,9 +4983,15 @@
               <w:jc w:val="left"/>
             </w:pPr>
             <w:r>
+              <w:rPr>
+                <w:sz w:val="16"/>
+              </w:rPr>
               <w:t xml:space="preserve">Offset 50 m,</w:t>
             </w:r>
             <w:r>
+              <w:rPr>
+                <w:sz w:val="16"/>
+              </w:rPr>
               <w:t xml:space="preserve"> </w:t>
             </w:r>
             <m:oMath>
@@ -4466,6 +5018,9 @@
               <w:jc w:val="center"/>
             </w:pPr>
             <w:r>
+              <w:rPr>
+                <w:sz w:val="16"/>
+              </w:rPr>
               <w:t xml:space="preserve">0.83</w:t>
             </w:r>
           </w:p>
@@ -4478,6 +5033,9 @@
               <w:jc w:val="center"/>
             </w:pPr>
             <w:r>
+              <w:rPr>
+                <w:sz w:val="16"/>
+              </w:rPr>
               <w:t xml:space="preserve">0.83</w:t>
             </w:r>
           </w:p>
@@ -4490,6 +5048,9 @@
               <w:jc w:val="center"/>
             </w:pPr>
             <w:r>
+              <w:rPr>
+                <w:sz w:val="16"/>
+              </w:rPr>
               <w:t xml:space="preserve">0.65</w:t>
             </w:r>
           </w:p>
@@ -4504,9 +5065,15 @@
               <w:jc w:val="left"/>
             </w:pPr>
             <w:r>
+              <w:rPr>
+                <w:sz w:val="16"/>
+              </w:rPr>
               <w:t xml:space="preserve">Fake stop,</w:t>
             </w:r>
             <w:r>
+              <w:rPr>
+                <w:sz w:val="16"/>
+              </w:rPr>
               <w:t xml:space="preserve"> </w:t>
             </w:r>
             <m:oMath>
@@ -4533,6 +5100,9 @@
               <w:jc w:val="center"/>
             </w:pPr>
             <w:r>
+              <w:rPr>
+                <w:sz w:val="16"/>
+              </w:rPr>
               <w:t xml:space="preserve">0.69</w:t>
             </w:r>
           </w:p>
@@ -4545,6 +5115,9 @@
               <w:jc w:val="center"/>
             </w:pPr>
             <w:r>
+              <w:rPr>
+                <w:sz w:val="16"/>
+              </w:rPr>
               <w:t xml:space="preserve">0.69</w:t>
             </w:r>
           </w:p>
@@ -4557,6 +5130,9 @@
               <w:jc w:val="center"/>
             </w:pPr>
             <w:r>
+              <w:rPr>
+                <w:sz w:val="16"/>
+              </w:rPr>
               <w:t xml:space="preserve">0.01</w:t>
             </w:r>
           </w:p>
@@ -4571,9 +5147,15 @@
               <w:jc w:val="left"/>
             </w:pPr>
             <w:r>
+              <w:rPr>
+                <w:sz w:val="16"/>
+              </w:rPr>
               <w:t xml:space="preserve">Fake stop,</w:t>
             </w:r>
             <w:r>
+              <w:rPr>
+                <w:sz w:val="16"/>
+              </w:rPr>
               <w:t xml:space="preserve"> </w:t>
             </w:r>
             <m:oMath>
@@ -4600,6 +5182,9 @@
               <w:jc w:val="center"/>
             </w:pPr>
             <w:r>
+              <w:rPr>
+                <w:sz w:val="16"/>
+              </w:rPr>
               <w:t xml:space="preserve">0.72</w:t>
             </w:r>
           </w:p>
@@ -4612,6 +5197,9 @@
               <w:jc w:val="center"/>
             </w:pPr>
             <w:r>
+              <w:rPr>
+                <w:sz w:val="16"/>
+              </w:rPr>
               <w:t xml:space="preserve">0.70</w:t>
             </w:r>
           </w:p>
@@ -4624,6 +5212,9 @@
               <w:jc w:val="center"/>
             </w:pPr>
             <w:r>
+              <w:rPr>
+                <w:sz w:val="16"/>
+              </w:rPr>
               <w:t xml:space="preserve">0.01</w:t>
             </w:r>
           </w:p>
@@ -4638,9 +5229,15 @@
               <w:jc w:val="left"/>
             </w:pPr>
             <w:r>
+              <w:rPr>
+                <w:sz w:val="16"/>
+              </w:rPr>
               <w:t xml:space="preserve">Convoy (unseen),</w:t>
             </w:r>
             <w:r>
+              <w:rPr>
+                <w:sz w:val="16"/>
+              </w:rPr>
               <w:t xml:space="preserve"> </w:t>
             </w:r>
             <m:oMath>
@@ -4667,6 +5264,9 @@
               <w:jc w:val="center"/>
             </w:pPr>
             <w:r>
+              <w:rPr>
+                <w:sz w:val="16"/>
+              </w:rPr>
               <w:t xml:space="preserve">0.87</w:t>
             </w:r>
           </w:p>
@@ -4679,6 +5279,9 @@
               <w:jc w:val="center"/>
             </w:pPr>
             <w:r>
+              <w:rPr>
+                <w:sz w:val="16"/>
+              </w:rPr>
               <w:t xml:space="preserve">0.86</w:t>
             </w:r>
           </w:p>
@@ -4691,6 +5294,9 @@
               <w:jc w:val="center"/>
             </w:pPr>
             <w:r>
+              <w:rPr>
+                <w:sz w:val="16"/>
+              </w:rPr>
               <w:t xml:space="preserve">0.86</w:t>
             </w:r>
           </w:p>
@@ -4705,9 +5311,15 @@
               <w:jc w:val="left"/>
             </w:pPr>
             <w:r>
+              <w:rPr>
+                <w:sz w:val="16"/>
+              </w:rPr>
               <w:t xml:space="preserve">Convoy (unseen),</w:t>
             </w:r>
             <w:r>
+              <w:rPr>
+                <w:sz w:val="16"/>
+              </w:rPr>
               <w:t xml:space="preserve"> </w:t>
             </w:r>
             <m:oMath>
@@ -4734,6 +5346,9 @@
               <w:jc w:val="center"/>
             </w:pPr>
             <w:r>
+              <w:rPr>
+                <w:sz w:val="16"/>
+              </w:rPr>
               <w:t xml:space="preserve">0.90</w:t>
             </w:r>
           </w:p>
@@ -4746,6 +5361,9 @@
               <w:jc w:val="center"/>
             </w:pPr>
             <w:r>
+              <w:rPr>
+                <w:sz w:val="16"/>
+              </w:rPr>
               <w:t xml:space="preserve">0.90</w:t>
             </w:r>
           </w:p>
@@ -4758,6 +5376,9 @@
               <w:jc w:val="center"/>
             </w:pPr>
             <w:r>
+              <w:rPr>
+                <w:sz w:val="16"/>
+              </w:rPr>
               <w:t xml:space="preserve">0.72</w:t>
             </w:r>
           </w:p>
@@ -4772,9 +5393,15 @@
               <w:jc w:val="left"/>
             </w:pPr>
             <w:r>
+              <w:rPr>
+                <w:sz w:val="16"/>
+              </w:rPr>
               <w:t xml:space="preserve">Offset 50 m along road,</w:t>
             </w:r>
             <w:r>
+              <w:rPr>
+                <w:sz w:val="16"/>
+              </w:rPr>
               <w:t xml:space="preserve"> </w:t>
             </w:r>
             <m:oMath>
@@ -4801,6 +5428,9 @@
               <w:jc w:val="center"/>
             </w:pPr>
             <w:r>
+              <w:rPr>
+                <w:sz w:val="16"/>
+              </w:rPr>
               <w:t xml:space="preserve">0.25</w:t>
             </w:r>
           </w:p>
@@ -4813,6 +5443,9 @@
               <w:jc w:val="center"/>
             </w:pPr>
             <w:r>
+              <w:rPr>
+                <w:sz w:val="16"/>
+              </w:rPr>
               <w:t xml:space="preserve">0.24</w:t>
             </w:r>
           </w:p>
@@ -4825,6 +5458,9 @@
               <w:jc w:val="center"/>
             </w:pPr>
             <w:r>
+              <w:rPr>
+                <w:sz w:val="16"/>
+              </w:rPr>
               <w:t xml:space="preserve">0.20</w:t>
             </w:r>
           </w:p>
@@ -4839,9 +5475,15 @@
               <w:jc w:val="left"/>
             </w:pPr>
             <w:r>
+              <w:rPr>
+                <w:sz w:val="16"/>
+              </w:rPr>
               <w:t xml:space="preserve">Convoy on own road,</w:t>
             </w:r>
             <w:r>
+              <w:rPr>
+                <w:sz w:val="16"/>
+              </w:rPr>
               <w:t xml:space="preserve"> </w:t>
             </w:r>
             <m:oMath>
@@ -4868,6 +5510,9 @@
               <w:jc w:val="center"/>
             </w:pPr>
             <w:r>
+              <w:rPr>
+                <w:sz w:val="16"/>
+              </w:rPr>
               <w:t xml:space="preserve">0.42</w:t>
             </w:r>
           </w:p>
@@ -4880,6 +5525,9 @@
               <w:jc w:val="center"/>
             </w:pPr>
             <w:r>
+              <w:rPr>
+                <w:sz w:val="16"/>
+              </w:rPr>
               <w:t xml:space="preserve">0.42</w:t>
             </w:r>
           </w:p>
@@ -4892,6 +5540,9 @@
               <w:jc w:val="center"/>
             </w:pPr>
             <w:r>
+              <w:rPr>
+                <w:sz w:val="16"/>
+              </w:rPr>
               <w:t xml:space="preserve">0.41</w:t>
             </w:r>
           </w:p>
@@ -4912,20 +5563,21 @@
     <w:tbl>
       <w:tblPr>
         <w:tblStyle w:val="Table"/>
-        <w:tblW w:type="auto" w:w="0"/>
         <w:tblLook w:firstRow="0" w:lastRow="0" w:firstColumn="0" w:lastColumn="0" w:noHBand="0" w:noVBand="0" w:val="0000"/>
         <w:tblCaption w:val="TABLE V. Recall on real attackers by the share of attacker vehicles among the senders in the window (message labels, mean of 2 seeds). Last row: recall gain of neighbour attention computed within each attack type (number of attack types with at least 200 attacker slots in the bin)."/>
         <w:tblBorders>
           <w:top w:val="single" w:sz="8" w:space="0" w:color="000000"/>
           <w:bottom w:val="single" w:sz="8" w:space="0" w:color="000000"/>
         </w:tblBorders>
+        <w:tblW w:w="5000" w:type="pct"/>
+        <w:tblLayout w:type="autofit"/>
       </w:tblPr>
       <w:tblGrid>
-        <w:gridCol w:w="1584"/>
-        <w:gridCol w:w="1584"/>
-        <w:gridCol w:w="1584"/>
-        <w:gridCol w:w="1584"/>
-        <w:gridCol w:w="1584"/>
+        <w:gridCol/>
+        <w:gridCol/>
+        <w:gridCol/>
+        <w:gridCol/>
+        <w:gridCol/>
       </w:tblGrid>
       <w:tr>
         <w:tc>
@@ -4940,6 +5592,9 @@
               <w:jc w:val="left"/>
             </w:pPr>
             <w:r>
+              <w:rPr>
+                <w:sz w:val="16"/>
+              </w:rPr>
               <w:t xml:space="preserve">Attacker share (%)</w:t>
             </w:r>
           </w:p>
@@ -4956,6 +5611,9 @@
               <w:jc w:val="center"/>
             </w:pPr>
             <w:r>
+              <w:rPr>
+                <w:sz w:val="16"/>
+              </w:rPr>
               <w:t xml:space="preserve">0–20</w:t>
             </w:r>
           </w:p>
@@ -4972,6 +5630,9 @@
               <w:jc w:val="center"/>
             </w:pPr>
             <w:r>
+              <w:rPr>
+                <w:sz w:val="16"/>
+              </w:rPr>
               <w:t xml:space="preserve">20–40</w:t>
             </w:r>
           </w:p>
@@ -4988,6 +5649,9 @@
               <w:jc w:val="center"/>
             </w:pPr>
             <w:r>
+              <w:rPr>
+                <w:sz w:val="16"/>
+              </w:rPr>
               <w:t xml:space="preserve">40–60</w:t>
             </w:r>
           </w:p>
@@ -5004,6 +5668,9 @@
               <w:jc w:val="center"/>
             </w:pPr>
             <w:r>
+              <w:rPr>
+                <w:sz w:val="16"/>
+              </w:rPr>
               <w:t xml:space="preserve">60–100</w:t>
             </w:r>
           </w:p>
@@ -5018,6 +5685,9 @@
               <w:jc w:val="left"/>
             </w:pPr>
             <w:r>
+              <w:rPr>
+                <w:sz w:val="16"/>
+              </w:rPr>
               <w:t xml:space="preserve">Windows</w:t>
             </w:r>
           </w:p>
@@ -5030,6 +5700,9 @@
               <w:jc w:val="center"/>
             </w:pPr>
             <w:r>
+              <w:rPr>
+                <w:sz w:val="16"/>
+              </w:rPr>
               <w:t xml:space="preserve">22,310</w:t>
             </w:r>
           </w:p>
@@ -5042,6 +5715,9 @@
               <w:jc w:val="center"/>
             </w:pPr>
             <w:r>
+              <w:rPr>
+                <w:sz w:val="16"/>
+              </w:rPr>
               <w:t xml:space="preserve">22,583</w:t>
             </w:r>
           </w:p>
@@ -5054,6 +5730,9 @@
               <w:jc w:val="center"/>
             </w:pPr>
             <w:r>
+              <w:rPr>
+                <w:sz w:val="16"/>
+              </w:rPr>
               <w:t xml:space="preserve">15,161</w:t>
             </w:r>
           </w:p>
@@ -5066,6 +5745,9 @@
               <w:jc w:val="center"/>
             </w:pPr>
             <w:r>
+              <w:rPr>
+                <w:sz w:val="16"/>
+              </w:rPr>
               <w:t xml:space="preserve">8,917</w:t>
             </w:r>
           </w:p>
@@ -5080,6 +5762,9 @@
               <w:jc w:val="left"/>
             </w:pPr>
             <w:r>
+              <w:rPr>
+                <w:sz w:val="16"/>
+              </w:rPr>
               <w:t xml:space="preserve">No nbr. att. recall</w:t>
             </w:r>
           </w:p>
@@ -5092,6 +5777,9 @@
               <w:jc w:val="center"/>
             </w:pPr>
             <w:r>
+              <w:rPr>
+                <w:sz w:val="16"/>
+              </w:rPr>
               <w:t xml:space="preserve">0.978</w:t>
             </w:r>
           </w:p>
@@ -5104,6 +5792,9 @@
               <w:jc w:val="center"/>
             </w:pPr>
             <w:r>
+              <w:rPr>
+                <w:sz w:val="16"/>
+              </w:rPr>
               <w:t xml:space="preserve">0.974</w:t>
             </w:r>
           </w:p>
@@ -5116,6 +5807,9 @@
               <w:jc w:val="center"/>
             </w:pPr>
             <w:r>
+              <w:rPr>
+                <w:sz w:val="16"/>
+              </w:rPr>
               <w:t xml:space="preserve">0.970</w:t>
             </w:r>
           </w:p>
@@ -5128,6 +5822,9 @@
               <w:jc w:val="center"/>
             </w:pPr>
             <w:r>
+              <w:rPr>
+                <w:sz w:val="16"/>
+              </w:rPr>
               <w:t xml:space="preserve">0.963</w:t>
             </w:r>
           </w:p>
@@ -5142,6 +5839,9 @@
               <w:jc w:val="left"/>
             </w:pPr>
             <w:r>
+              <w:rPr>
+                <w:sz w:val="16"/>
+              </w:rPr>
               <w:t xml:space="preserve">No nbr. att. FPR (%)</w:t>
             </w:r>
           </w:p>
@@ -5154,6 +5854,9 @@
               <w:jc w:val="center"/>
             </w:pPr>
             <w:r>
+              <w:rPr>
+                <w:sz w:val="16"/>
+              </w:rPr>
               <w:t xml:space="preserve">0.98</w:t>
             </w:r>
           </w:p>
@@ -5166,6 +5869,9 @@
               <w:jc w:val="center"/>
             </w:pPr>
             <w:r>
+              <w:rPr>
+                <w:sz w:val="16"/>
+              </w:rPr>
               <w:t xml:space="preserve">0.93</w:t>
             </w:r>
           </w:p>
@@ -5178,6 +5884,9 @@
               <w:jc w:val="center"/>
             </w:pPr>
             <w:r>
+              <w:rPr>
+                <w:sz w:val="16"/>
+              </w:rPr>
               <w:t xml:space="preserve">0.70</w:t>
             </w:r>
           </w:p>
@@ -5190,6 +5899,9 @@
               <w:jc w:val="center"/>
             </w:pPr>
             <w:r>
+              <w:rPr>
+                <w:sz w:val="16"/>
+              </w:rPr>
               <w:t xml:space="preserve">1.01</w:t>
             </w:r>
           </w:p>
@@ -5204,6 +5916,9 @@
               <w:jc w:val="left"/>
             </w:pPr>
             <w:r>
+              <w:rPr>
+                <w:sz w:val="16"/>
+              </w:rPr>
               <w:t xml:space="preserve">Ours recall</w:t>
             </w:r>
           </w:p>
@@ -5216,6 +5931,9 @@
               <w:jc w:val="center"/>
             </w:pPr>
             <w:r>
+              <w:rPr>
+                <w:sz w:val="16"/>
+              </w:rPr>
               <w:t xml:space="preserve">0.979</w:t>
             </w:r>
           </w:p>
@@ -5228,6 +5946,9 @@
               <w:jc w:val="center"/>
             </w:pPr>
             <w:r>
+              <w:rPr>
+                <w:sz w:val="16"/>
+              </w:rPr>
               <w:t xml:space="preserve">0.975</w:t>
             </w:r>
           </w:p>
@@ -5240,6 +5961,9 @@
               <w:jc w:val="center"/>
             </w:pPr>
             <w:r>
+              <w:rPr>
+                <w:sz w:val="16"/>
+              </w:rPr>
               <w:t xml:space="preserve">0.971</w:t>
             </w:r>
           </w:p>
@@ -5252,6 +5976,9 @@
               <w:jc w:val="center"/>
             </w:pPr>
             <w:r>
+              <w:rPr>
+                <w:sz w:val="16"/>
+              </w:rPr>
               <w:t xml:space="preserve">0.959</w:t>
             </w:r>
           </w:p>
@@ -5266,6 +5993,9 @@
               <w:jc w:val="left"/>
             </w:pPr>
             <w:r>
+              <w:rPr>
+                <w:sz w:val="16"/>
+              </w:rPr>
               <w:t xml:space="preserve">Ours FPR (%)</w:t>
             </w:r>
           </w:p>
@@ -5278,6 +6008,9 @@
               <w:jc w:val="center"/>
             </w:pPr>
             <w:r>
+              <w:rPr>
+                <w:sz w:val="16"/>
+              </w:rPr>
               <w:t xml:space="preserve">0.68</w:t>
             </w:r>
           </w:p>
@@ -5290,6 +6023,9 @@
               <w:jc w:val="center"/>
             </w:pPr>
             <w:r>
+              <w:rPr>
+                <w:sz w:val="16"/>
+              </w:rPr>
               <w:t xml:space="preserve">0.64</w:t>
             </w:r>
           </w:p>
@@ -5302,6 +6038,9 @@
               <w:jc w:val="center"/>
             </w:pPr>
             <w:r>
+              <w:rPr>
+                <w:sz w:val="16"/>
+              </w:rPr>
               <w:t xml:space="preserve">0.36</w:t>
             </w:r>
           </w:p>
@@ -5314,6 +6053,9 @@
               <w:jc w:val="center"/>
             </w:pPr>
             <w:r>
+              <w:rPr>
+                <w:sz w:val="16"/>
+              </w:rPr>
               <w:t xml:space="preserve">0.77</w:t>
             </w:r>
           </w:p>
@@ -5328,6 +6070,9 @@
               <w:jc w:val="left"/>
             </w:pPr>
             <w:r>
+              <w:rPr>
+                <w:sz w:val="16"/>
+              </w:rPr>
               <w:t xml:space="preserve">Within-attack gain</w:t>
             </w:r>
           </w:p>
@@ -5340,6 +6085,9 @@
               <w:jc w:val="center"/>
             </w:pPr>
             <w:r>
+              <w:rPr>
+                <w:sz w:val="16"/>
+              </w:rPr>
               <w:t xml:space="preserve">+0.002 (4)</w:t>
             </w:r>
           </w:p>
@@ -5352,6 +6100,9 @@
               <w:jc w:val="center"/>
             </w:pPr>
             <w:r>
+              <w:rPr>
+                <w:sz w:val="16"/>
+              </w:rPr>
               <w:t xml:space="preserve">+0.001 (14)</w:t>
             </w:r>
           </w:p>
@@ -5364,6 +6115,9 @@
               <w:jc w:val="center"/>
             </w:pPr>
             <w:r>
+              <w:rPr>
+                <w:sz w:val="16"/>
+              </w:rPr>
               <w:t xml:space="preserve">+0.001 (14)</w:t>
             </w:r>
           </w:p>
@@ -5376,6 +6130,9 @@
               <w:jc w:val="center"/>
             </w:pPr>
             <w:r>
+              <w:rPr>
+                <w:sz w:val="16"/>
+              </w:rPr>
               <w:t xml:space="preserve">-0.004 (14)</w:t>
             </w:r>
           </w:p>
@@ -5386,6 +6143,7 @@
     <w:p>
       <w:pPr>
         <w:pStyle w:val="FirstParagraph"/>
+        <w:jc w:val="both"/>
       </w:pPr>
       <w:r>
         <w:rPr>
@@ -5440,6 +6198,7 @@
     <w:p>
       <w:pPr>
         <w:pStyle w:val="BodyText"/>
+        <w:jc w:val="both"/>
       </w:pPr>
       <w:r>
         <w:rPr>
@@ -5527,6 +6286,7 @@
     <w:p>
       <w:pPr>
         <w:pStyle w:val="BodyText"/>
+        <w:jc w:val="both"/>
       </w:pPr>
       <w:r>
         <w:rPr>
@@ -5575,7 +6335,7 @@
       <w:r>
         <w:drawing>
           <wp:inline>
-            <wp:extent cx="3108960" cy="1600199"/>
+            <wp:extent cx="3017520" cy="1553134"/>
             <wp:effectExtent b="0" l="0" r="0" t="0"/>
             <wp:docPr descr="" title="" id="37" name="Picture"/>
             <a:graphic>
@@ -5596,7 +6356,7 @@
                   <pic:spPr bwMode="auto">
                     <a:xfrm>
                       <a:off x="0" y="0"/>
-                      <a:ext cx="3108960" cy="1600199"/>
+                      <a:ext cx="3017520" cy="1553134"/>
                     </a:xfrm>
                     <a:prstGeom prst="rect">
                       <a:avLst/>
@@ -5633,6 +6393,7 @@
     <w:p>
       <w:pPr>
         <w:pStyle w:val="FirstParagraph"/>
+        <w:jc w:val="both"/>
       </w:pPr>
       <w:r>
         <w:t xml:space="preserve">Two map-aware attacks remain hard: shifting the claimed position</w:t>
@@ -5663,6 +6424,7 @@
     <w:p>
       <w:pPr>
         <w:pStyle w:val="BodyText"/>
+        <w:jc w:val="both"/>
       </w:pPr>
       <w:r>
         <w:rPr>
@@ -5731,6 +6493,7 @@
     <w:p>
       <w:pPr>
         <w:pStyle w:val="FirstParagraph"/>
+        <w:jc w:val="both"/>
       </w:pPr>
       <w:r>
         <w:t xml:space="preserve">We add the four Sybil attacks (18 of 19 attack types; 141,260 training windows plus 51,033 with injected lies, 88,695 test windows) and the three</w:t>
@@ -5780,20 +6543,21 @@
     <w:tbl>
       <w:tblPr>
         <w:tblStyle w:val="Table"/>
-        <w:tblW w:type="auto" w:w="0"/>
         <w:tblLook w:firstRow="1" w:lastRow="0" w:firstColumn="0" w:lastColumn="0" w:noHBand="0" w:noVBand="0" w:val="0020"/>
         <w:tblCaption w:val="TABLE VI. Extension to 18 of the 19 attack types (the 14 above plus four Sybil attacks), 88,695 test windows. Ours: mean score of three models; no-neighbour rows: mean of two models (seeds 0, 1); thresholds picked on validation; per-attack F1 in Fig. 4."/>
         <w:tblBorders>
           <w:top w:val="single" w:sz="8" w:space="0" w:color="000000"/>
           <w:bottom w:val="single" w:sz="8" w:space="0" w:color="000000"/>
         </w:tblBorders>
+        <w:tblW w:w="5000" w:type="pct"/>
+        <w:tblLayout w:type="autofit"/>
       </w:tblPr>
       <w:tblGrid>
-        <w:gridCol w:w="1584"/>
-        <w:gridCol w:w="1584"/>
-        <w:gridCol w:w="1584"/>
-        <w:gridCol w:w="1584"/>
-        <w:gridCol w:w="1584"/>
+        <w:gridCol/>
+        <w:gridCol/>
+        <w:gridCol/>
+        <w:gridCol/>
+        <w:gridCol/>
       </w:tblGrid>
       <w:tr>
         <w:trPr>
@@ -5811,6 +6575,9 @@
               <w:jc w:val="left"/>
             </w:pPr>
             <w:r>
+              <w:rPr>
+                <w:sz w:val="16"/>
+              </w:rPr>
               <w:t xml:space="preserve">Overall</w:t>
             </w:r>
           </w:p>
@@ -5827,6 +6594,9 @@
               <w:jc w:val="center"/>
             </w:pPr>
             <w:r>
+              <w:rPr>
+                <w:sz w:val="16"/>
+              </w:rPr>
               <w:t xml:space="preserve">Precision</w:t>
             </w:r>
           </w:p>
@@ -5843,6 +6613,9 @@
               <w:jc w:val="center"/>
             </w:pPr>
             <w:r>
+              <w:rPr>
+                <w:sz w:val="16"/>
+              </w:rPr>
               <w:t xml:space="preserve">Recall</w:t>
             </w:r>
           </w:p>
@@ -5859,6 +6632,9 @@
               <w:jc w:val="center"/>
             </w:pPr>
             <w:r>
+              <w:rPr>
+                <w:sz w:val="16"/>
+              </w:rPr>
               <w:t xml:space="preserve">F1</w:t>
             </w:r>
           </w:p>
@@ -5875,6 +6651,9 @@
               <w:jc w:val="center"/>
             </w:pPr>
             <w:r>
+              <w:rPr>
+                <w:sz w:val="16"/>
+              </w:rPr>
               <w:t xml:space="preserve">Accuracy</w:t>
             </w:r>
           </w:p>
@@ -5889,6 +6668,9 @@
               <w:jc w:val="left"/>
             </w:pPr>
             <w:r>
+              <w:rPr>
+                <w:sz w:val="16"/>
+              </w:rPr>
               <w:t xml:space="preserve">Ours, message labels</w:t>
             </w:r>
           </w:p>
@@ -5901,6 +6683,9 @@
               <w:jc w:val="center"/>
             </w:pPr>
             <w:r>
+              <w:rPr>
+                <w:sz w:val="16"/>
+              </w:rPr>
               <w:t xml:space="preserve">96.30</w:t>
             </w:r>
           </w:p>
@@ -5913,6 +6698,9 @@
               <w:jc w:val="center"/>
             </w:pPr>
             <w:r>
+              <w:rPr>
+                <w:sz w:val="16"/>
+              </w:rPr>
               <w:t xml:space="preserve">95.46</w:t>
             </w:r>
           </w:p>
@@ -5925,6 +6713,9 @@
               <w:jc w:val="center"/>
             </w:pPr>
             <w:r>
+              <w:rPr>
+                <w:sz w:val="16"/>
+              </w:rPr>
               <w:t xml:space="preserve">95.88</w:t>
             </w:r>
           </w:p>
@@ -5937,6 +6728,9 @@
               <w:jc w:val="center"/>
             </w:pPr>
             <w:r>
+              <w:rPr>
+                <w:sz w:val="16"/>
+              </w:rPr>
               <w:t xml:space="preserve">97.04</w:t>
             </w:r>
           </w:p>
@@ -5951,6 +6745,9 @@
               <w:jc w:val="left"/>
             </w:pPr>
             <w:r>
+              <w:rPr>
+                <w:sz w:val="16"/>
+              </w:rPr>
               <w:t xml:space="preserve">No nbr. attention, message</w:t>
             </w:r>
           </w:p>
@@ -5963,6 +6760,9 @@
               <w:jc w:val="center"/>
             </w:pPr>
             <w:r>
+              <w:rPr>
+                <w:sz w:val="16"/>
+              </w:rPr>
               <w:t xml:space="preserve">96.28</w:t>
             </w:r>
           </w:p>
@@ -5975,6 +6775,9 @@
               <w:jc w:val="center"/>
             </w:pPr>
             <w:r>
+              <w:rPr>
+                <w:sz w:val="16"/>
+              </w:rPr>
               <w:t xml:space="preserve">92.69</w:t>
             </w:r>
           </w:p>
@@ -5987,6 +6790,9 @@
               <w:jc w:val="center"/>
             </w:pPr>
             <w:r>
+              <w:rPr>
+                <w:sz w:val="16"/>
+              </w:rPr>
               <w:t xml:space="preserve">94.45</w:t>
             </w:r>
           </w:p>
@@ -5999,6 +6805,9 @@
               <w:jc w:val="center"/>
             </w:pPr>
             <w:r>
+              <w:rPr>
+                <w:sz w:val="16"/>
+              </w:rPr>
               <w:t xml:space="preserve">96.07</w:t>
             </w:r>
           </w:p>
@@ -6013,6 +6822,9 @@
               <w:jc w:val="left"/>
             </w:pPr>
             <w:r>
+              <w:rPr>
+                <w:sz w:val="16"/>
+              </w:rPr>
               <w:t xml:space="preserve">Ours, vehicle labels</w:t>
             </w:r>
           </w:p>
@@ -6025,6 +6837,9 @@
               <w:jc w:val="center"/>
             </w:pPr>
             <w:r>
+              <w:rPr>
+                <w:sz w:val="16"/>
+              </w:rPr>
               <w:t xml:space="preserve">96.33</w:t>
             </w:r>
           </w:p>
@@ -6037,6 +6852,9 @@
               <w:jc w:val="center"/>
             </w:pPr>
             <w:r>
+              <w:rPr>
+                <w:sz w:val="16"/>
+              </w:rPr>
               <w:t xml:space="preserve">94.44</w:t>
             </w:r>
           </w:p>
@@ -6049,6 +6867,9 @@
               <w:jc w:val="center"/>
             </w:pPr>
             <w:r>
+              <w:rPr>
+                <w:sz w:val="16"/>
+              </w:rPr>
               <w:t xml:space="preserve">95.38</w:t>
             </w:r>
           </w:p>
@@ -6061,6 +6882,9 @@
               <w:jc w:val="center"/>
             </w:pPr>
             <w:r>
+              <w:rPr>
+                <w:sz w:val="16"/>
+              </w:rPr>
               <w:t xml:space="preserve">96.66</w:t>
             </w:r>
           </w:p>
@@ -6075,6 +6899,9 @@
               <w:jc w:val="left"/>
             </w:pPr>
             <w:r>
+              <w:rPr>
+                <w:sz w:val="16"/>
+              </w:rPr>
               <w:t xml:space="preserve">No nbr. attention, vehicle</w:t>
             </w:r>
           </w:p>
@@ -6087,6 +6914,9 @@
               <w:jc w:val="center"/>
             </w:pPr>
             <w:r>
+              <w:rPr>
+                <w:sz w:val="16"/>
+              </w:rPr>
               <w:t xml:space="preserve">96.31</w:t>
             </w:r>
           </w:p>
@@ -6099,6 +6929,9 @@
               <w:jc w:val="center"/>
             </w:pPr>
             <w:r>
+              <w:rPr>
+                <w:sz w:val="16"/>
+              </w:rPr>
               <w:t xml:space="preserve">91.69</w:t>
             </w:r>
           </w:p>
@@ -6111,6 +6944,9 @@
               <w:jc w:val="center"/>
             </w:pPr>
             <w:r>
+              <w:rPr>
+                <w:sz w:val="16"/>
+              </w:rPr>
               <w:t xml:space="preserve">93.94</w:t>
             </w:r>
           </w:p>
@@ -6123,6 +6959,9 @@
               <w:jc w:val="center"/>
             </w:pPr>
             <w:r>
+              <w:rPr>
+                <w:sz w:val="16"/>
+              </w:rPr>
               <w:t xml:space="preserve">95.68</w:t>
             </w:r>
           </w:p>
@@ -6139,7 +6978,7 @@
       <w:r>
         <w:drawing>
           <wp:inline>
-            <wp:extent cx="3108960" cy="2834640"/>
+            <wp:extent cx="3017520" cy="2751268"/>
             <wp:effectExtent b="0" l="0" r="0" t="0"/>
             <wp:docPr descr="" title="" id="43" name="Picture"/>
             <a:graphic>
@@ -6160,7 +6999,7 @@
                   <pic:spPr bwMode="auto">
                     <a:xfrm>
                       <a:off x="0" y="0"/>
-                      <a:ext cx="3108960" cy="2834640"/>
+                      <a:ext cx="3017520" cy="2751268"/>
                     </a:xfrm>
                     <a:prstGeom prst="rect">
                       <a:avLst/>
@@ -6203,7 +7042,7 @@
       <w:r>
         <w:drawing>
           <wp:inline>
-            <wp:extent cx="3108960" cy="1508760"/>
+            <wp:extent cx="3017520" cy="1464384"/>
             <wp:effectExtent b="0" l="0" r="0" t="0"/>
             <wp:docPr descr="" title="" id="47" name="Picture"/>
             <a:graphic>
@@ -6224,7 +7063,7 @@
                   <pic:spPr bwMode="auto">
                     <a:xfrm>
                       <a:off x="0" y="0"/>
-                      <a:ext cx="3108960" cy="1508760"/>
+                      <a:ext cx="3017520" cy="1464384"/>
                     </a:xfrm>
                     <a:prstGeom prst="rect">
                       <a:avLst/>
@@ -6255,6 +7094,7 @@
     <w:p>
       <w:pPr>
         <w:pStyle w:val="FirstParagraph"/>
+        <w:jc w:val="both"/>
       </w:pPr>
       <w:r>
         <w:t xml:space="preserve">On message labels (Table VI) the FPR is 2.07%, and all four measures are</w:t>
@@ -6337,6 +7177,7 @@
     <w:p>
       <w:pPr>
         <w:pStyle w:val="FirstParagraph"/>
+        <w:jc w:val="both"/>
       </w:pPr>
       <w:r>
         <w:rPr>
@@ -6385,6 +7226,7 @@
     <w:p>
       <w:pPr>
         <w:pStyle w:val="BodyText"/>
+        <w:jc w:val="both"/>
       </w:pPr>
       <w:r>
         <w:rPr>
@@ -6421,6 +7263,7 @@
     <w:p>
       <w:pPr>
         <w:pStyle w:val="BodyText"/>
+        <w:jc w:val="both"/>
       </w:pPr>
       <w:r>
         <w:rPr>
@@ -6467,6 +7310,7 @@
     <w:p>
       <w:pPr>
         <w:pStyle w:val="FirstParagraph"/>
+        <w:jc w:val="both"/>
       </w:pPr>
       <w:r>
         <w:t xml:space="preserve">The benchmark is simulated; the main results cover 14 of 19 attack types and the Sybil extension 18 (below the 97.37% reference);</w:t>
@@ -6493,6 +7337,7 @@
     <w:p>
       <w:pPr>
         <w:pStyle w:val="BodyText"/>
+        <w:jc w:val="both"/>
       </w:pPr>
       <w:r>
         <w:t xml:space="preserve">Within these limits, plausibility checks computed from the claims did most of the work: they moved the detector from F1 94.9% to</w:t>
@@ -6529,6 +7374,7 @@
     <w:p>
       <w:pPr>
         <w:pStyle w:val="FirstParagraph"/>
+        <w:jc w:val="both"/>
       </w:pPr>
       <w:r>
         <w:t xml:space="preserve">[1] R. W. van der Heijden, T. Lukaseder, and F. Kargl,</w:t>
@@ -6562,6 +7408,7 @@
     <w:p>
       <w:pPr>
         <w:pStyle w:val="BodyText"/>
+        <w:jc w:val="both"/>
       </w:pPr>
       <w:r>
         <w:t xml:space="preserve">[2] J. Kamel, M. Wolf, R. W. van der Heijden, A. Kaiser, P. Urien, and F. Kargl,</w:t>
@@ -6595,6 +7442,7 @@
     <w:p>
       <w:pPr>
         <w:pStyle w:val="BodyText"/>
+        <w:jc w:val="both"/>
       </w:pPr>
       <w:r>
         <w:t xml:space="preserve">[3] S. A. Abdel Hakeem and H. Kim,</w:t>
@@ -6622,6 +7470,7 @@
     <w:p>
       <w:pPr>
         <w:pStyle w:val="BodyText"/>
+        <w:jc w:val="both"/>
       </w:pPr>
       <w:r>
         <w:t xml:space="preserve">[4] S. So, J. Petit, and D. Starobinski,</w:t>
@@ -6655,6 +7504,7 @@
     <w:p>
       <w:pPr>
         <w:pStyle w:val="BodyText"/>
+        <w:jc w:val="both"/>
       </w:pPr>
       <w:r>
         <w:t xml:space="preserve">[5] S. So, P. Sharma, and J. Petit,</w:t>
@@ -6688,6 +7538,7 @@
     <w:p>
       <w:pPr>
         <w:pStyle w:val="BodyText"/>
+        <w:jc w:val="both"/>
       </w:pPr>
       <w:r>
         <w:t xml:space="preserve">[6] P. K. Singh, S. Gupta, R. Vashistha, S. K. Nandi, and S. Nandi,</w:t>
@@ -6721,6 +7572,7 @@
     <w:p>
       <w:pPr>
         <w:pStyle w:val="BodyText"/>
+        <w:jc w:val="both"/>
       </w:pPr>
       <w:r>
         <w:t xml:space="preserve">[7] A. Sharma and A. Jaekel,</w:t>
@@ -6748,6 +7600,7 @@
     <w:p>
       <w:pPr>
         <w:pStyle w:val="BodyText"/>
+        <w:jc w:val="both"/>
       </w:pPr>
       <w:r>
         <w:t xml:space="preserve">[8] S. Gyawali, Y. Qian, and R. Q. Hu,</w:t>
@@ -6775,6 +7628,7 @@
     <w:p>
       <w:pPr>
         <w:pStyle w:val="BodyText"/>
+        <w:jc w:val="both"/>
       </w:pPr>
       <w:r>
         <w:t xml:space="preserve">[9] K. Kalogiannis, A. M. Hussain, and P. Papadimitratos,</w:t>
@@ -6795,6 +7649,7 @@
     <w:p>
       <w:pPr>
         <w:pStyle w:val="BodyText"/>
+        <w:jc w:val="both"/>
       </w:pPr>
       <w:r>
         <w:t xml:space="preserve">[10] H. Li, K. Kalogiannis, A. M. Hussain, and P. Papadimitratos,</w:t>
@@ -6815,6 +7670,7 @@
     <w:p>
       <w:pPr>
         <w:pStyle w:val="BodyText"/>
+        <w:jc w:val="both"/>
       </w:pPr>
       <w:r>
         <w:t xml:space="preserve">[11] S. Ruj, M. A. Cavenaghi, Z. Huang, A. Nayak, and I. Stojmenovic,</w:t>
@@ -6835,6 +7691,7 @@
     <w:p>
       <w:pPr>
         <w:pStyle w:val="BodyText"/>
+        <w:jc w:val="both"/>
       </w:pPr>
       <w:r>
         <w:t xml:space="preserve">[12] E. Mármol Campos, A. González Vidal, J. L. Hernández Ramos, and A. Skarmeta,</w:t>
@@ -6855,6 +7712,7 @@
     <w:p>
       <w:pPr>
         <w:pStyle w:val="BodyText"/>
+        <w:jc w:val="both"/>
       </w:pPr>
       <w:r>
         <w:t xml:space="preserve">[13] U. Demir, Y. E. Sagduyu, T. Erpek, H. Jafari, S. Kompella, and M. Xue,</w:t>
@@ -6875,6 +7733,7 @@
     <w:p>
       <w:pPr>
         <w:pStyle w:val="BodyText"/>
+        <w:jc w:val="both"/>
       </w:pPr>
       <w:r>
         <w:t xml:space="preserve">[14] W. Hamhoum and S. Cherkaoui,</w:t>
@@ -6895,6 +7754,7 @@
     <w:p>
       <w:pPr>
         <w:pStyle w:val="BodyText"/>
+        <w:jc w:val="both"/>
       </w:pPr>
       <w:r>
         <w:t xml:space="preserve">[15] M. Thomas, A. Borah, and A. Paranjothi,</w:t>
@@ -6922,6 +7782,7 @@
     <w:p>
       <w:pPr>
         <w:pStyle w:val="BodyText"/>
+        <w:jc w:val="both"/>
       </w:pPr>
       <w:r>
         <w:t xml:space="preserve">[16] M. S. T. Khan, M. S. A. Utsho, and M. Jahan,</w:t>
@@ -6942,6 +7803,7 @@
     <w:p>
       <w:pPr>
         <w:pStyle w:val="BodyText"/>
+        <w:jc w:val="both"/>
       </w:pPr>
       <w:r>
         <w:t xml:space="preserve">[17] M. Franceschini,</w:t>
@@ -6962,6 +7824,7 @@
     <w:p>
       <w:pPr>
         <w:pStyle w:val="BodyText"/>
+        <w:jc w:val="both"/>
       </w:pPr>
       <w:r>
         <w:t xml:space="preserve">[18] A. Boualouache and T. Engel,</w:t>
@@ -6980,9 +7843,12 @@
       </w:r>
     </w:p>
     <w:sectPr>
+      <w:type w:val="continuous"/>
       <w:footnotePr>
         <w:numRestart w:val="eachSect"/>
       </w:footnotePr>
+      <w:pgMar w:left="1008" w:right="1008" w:top="1080" w:bottom="1080"/>
+      <w:cols w:num="2" w:space="360"/>
     </w:sectPr>
   </w:body>
 </w:document>

</xml_diff>